<commit_message>
Refresh report visuals for updated SOC topic
</commit_message>
<xml_diff>
--- a/outputs/Bao_cao_TTTN_A11_Agentic_SOC_Local_First.docx
+++ b/outputs/Bao_cao_TTTN_A11_Agentic_SOC_Local_First.docx
@@ -116,10 +116,17 @@
       <w:r>
         <w:rPr>
           <w:b/>
-          <w:sz w:val="36"/>
-          <w:lang w:val="vi-VN" w:eastAsia="vi-VN"/>
+          <w:sz w:val="28"/>
         </w:rPr>
-        <w:t>XÂY DỰNG HỆ THỐNG TỰ ĐỘNG HÓA VẬN HÀNH SOC BẰNG MÔ HÌNH AGENTIC AI TRÊN HẠ TẦNG CỤC BỘ</w:t>
+        <w:t>XÂY DỰNG HỆ THỐNG SOC REAL-TIME LOCAL-FIRST</w:t>
+      </w:r>
+      <w:r>
+        <w:rPr>
+          <w:b/>
+          <w:sz w:val="28"/>
+        </w:rPr>
+        <w:br/>
+        <w:t>ỨNG DỤNG AGENTIC AI, RAG VÀ N8N TRÊN UBUNTU SERVER</w:t>
       </w:r>
     </w:p>
     <w:tbl>
@@ -598,10 +605,17 @@
       <w:r>
         <w:rPr>
           <w:b/>
-          <w:sz w:val="36"/>
-          <w:lang w:val="vi-VN" w:eastAsia="vi-VN"/>
+          <w:sz w:val="28"/>
         </w:rPr>
-        <w:t>XÂY DỰNG HỆ THỐNG TỰ ĐỘNG HÓA VẬN HÀNH SOC BẰNG MÔ HÌNH AGENTIC AI TRÊN HẠ TẦNG CỤC BỘ</w:t>
+        <w:t>XÂY DỰNG HỆ THỐNG SOC REAL-TIME LOCAL-FIRST</w:t>
+      </w:r>
+      <w:r>
+        <w:rPr>
+          <w:b/>
+          <w:sz w:val="28"/>
+        </w:rPr>
+        <w:br/>
+        <w:t>ỨNG DỤNG AGENTIC AI, RAG VÀ N8N TRÊN UBUNTU SERVER</w:t>
       </w:r>
     </w:p>
     <w:tbl>
@@ -971,7 +985,7 @@
       <w:pPr>
         <w:pStyle w:val="TableCaption"/>
       </w:pPr>
-      <w:bookmarkStart w:id="1" w:name="_Toc236262500"/>
+      <w:bookmarkStart w:id="1" w:name="_Toc236263696"/>
       <w:r>
         <w:rPr>
           <w:lang w:val="vi-VN" w:eastAsia="vi-VN"/>
@@ -1104,16 +1118,11 @@
             <w:vAlign w:val="center"/>
           </w:tcPr>
           <w:p>
-            <w:pPr>
-              <w:spacing w:before="0" w:after="0" w:line="240" w:lineRule="auto"/>
-              <w:jc w:val="left"/>
-            </w:pPr>
-            <w:r>
-              <w:rPr>
-                <w:sz w:val="21"/>
-                <w:lang w:val="vi-VN" w:eastAsia="vi-VN"/>
-              </w:rPr>
-              <w:t>Xây dựng hệ thống Tự động hóa vận hành SOC bằng mô hình Agentic AI trên hạ tầng cục bộ</w:t>
+            <w:r>
+              <w:rPr>
+                <w:sz w:val="22"/>
+              </w:rPr>
+              <w:t>Xây dựng hệ thống SOC real-time local-first ứng dụng Agentic AI, RAG và n8n trên Ubuntu Server</w:t>
             </w:r>
           </w:p>
         </w:tc>
@@ -1802,7 +1811,7 @@
         </w:rPr>
         <w:fldChar w:fldCharType="separate"/>
       </w:r>
-      <w:hyperlink w:anchor="_Toc236262432" w:history="1">
+      <w:hyperlink w:anchor="_Toc236263628" w:history="1">
         <w:r>
           <w:rPr>
             <w:rStyle w:val="Hyperlink"/>
@@ -1830,7 +1839,7 @@
             <w:noProof/>
             <w:webHidden/>
           </w:rPr>
-          <w:instrText xml:space="preserve"> PAGEREF _Toc236262432 \h </w:instrText>
+          <w:instrText xml:space="preserve"> PAGEREF _Toc236263628 \h </w:instrText>
         </w:r>
         <w:r>
           <w:rPr>
@@ -1873,7 +1882,7 @@
           <w:sz w:val="22"/>
         </w:rPr>
       </w:pPr>
-      <w:hyperlink w:anchor="_Toc236262433" w:history="1">
+      <w:hyperlink w:anchor="_Toc236263629" w:history="1">
         <w:r>
           <w:rPr>
             <w:rStyle w:val="Hyperlink"/>
@@ -1901,7 +1910,7 @@
             <w:noProof/>
             <w:webHidden/>
           </w:rPr>
-          <w:instrText xml:space="preserve"> PAGEREF _Toc236262433 \h </w:instrText>
+          <w:instrText xml:space="preserve"> PAGEREF _Toc236263629 \h </w:instrText>
         </w:r>
         <w:r>
           <w:rPr>
@@ -1944,7 +1953,7 @@
           <w:sz w:val="22"/>
         </w:rPr>
       </w:pPr>
-      <w:hyperlink w:anchor="_Toc236262434" w:history="1">
+      <w:hyperlink w:anchor="_Toc236263630" w:history="1">
         <w:r>
           <w:rPr>
             <w:rStyle w:val="Hyperlink"/>
@@ -1972,7 +1981,7 @@
             <w:noProof/>
             <w:webHidden/>
           </w:rPr>
-          <w:instrText xml:space="preserve"> PAGEREF _Toc236262434 \h </w:instrText>
+          <w:instrText xml:space="preserve"> PAGEREF _Toc236263630 \h </w:instrText>
         </w:r>
         <w:r>
           <w:rPr>
@@ -2015,7 +2024,7 @@
           <w:sz w:val="22"/>
         </w:rPr>
       </w:pPr>
-      <w:hyperlink w:anchor="_Toc236262435" w:history="1">
+      <w:hyperlink w:anchor="_Toc236263631" w:history="1">
         <w:r>
           <w:rPr>
             <w:rStyle w:val="Hyperlink"/>
@@ -2043,7 +2052,7 @@
             <w:noProof/>
             <w:webHidden/>
           </w:rPr>
-          <w:instrText xml:space="preserve"> PAGEREF _Toc236262435 \h </w:instrText>
+          <w:instrText xml:space="preserve"> PAGEREF _Toc236263631 \h </w:instrText>
         </w:r>
         <w:r>
           <w:rPr>
@@ -2086,7 +2095,7 @@
           <w:sz w:val="22"/>
         </w:rPr>
       </w:pPr>
-      <w:hyperlink w:anchor="_Toc236262436" w:history="1">
+      <w:hyperlink w:anchor="_Toc236263632" w:history="1">
         <w:r>
           <w:rPr>
             <w:rStyle w:val="Hyperlink"/>
@@ -2114,7 +2123,7 @@
             <w:noProof/>
             <w:webHidden/>
           </w:rPr>
-          <w:instrText xml:space="preserve"> PAGEREF _Toc236262436 \h </w:instrText>
+          <w:instrText xml:space="preserve"> PAGEREF _Toc236263632 \h </w:instrText>
         </w:r>
         <w:r>
           <w:rPr>
@@ -2157,7 +2166,7 @@
           <w:sz w:val="22"/>
         </w:rPr>
       </w:pPr>
-      <w:hyperlink w:anchor="_Toc236262437" w:history="1">
+      <w:hyperlink w:anchor="_Toc236263633" w:history="1">
         <w:r>
           <w:rPr>
             <w:rStyle w:val="Hyperlink"/>
@@ -2185,7 +2194,7 @@
             <w:noProof/>
             <w:webHidden/>
           </w:rPr>
-          <w:instrText xml:space="preserve"> PAGEREF _Toc236262437 \h </w:instrText>
+          <w:instrText xml:space="preserve"> PAGEREF _Toc236263633 \h </w:instrText>
         </w:r>
         <w:r>
           <w:rPr>
@@ -2228,7 +2237,7 @@
           <w:sz w:val="22"/>
         </w:rPr>
       </w:pPr>
-      <w:hyperlink w:anchor="_Toc236262438" w:history="1">
+      <w:hyperlink w:anchor="_Toc236263634" w:history="1">
         <w:r>
           <w:rPr>
             <w:rStyle w:val="Hyperlink"/>
@@ -2256,7 +2265,7 @@
             <w:noProof/>
             <w:webHidden/>
           </w:rPr>
-          <w:instrText xml:space="preserve"> PAGEREF _Toc236262438 \h </w:instrText>
+          <w:instrText xml:space="preserve"> PAGEREF _Toc236263634 \h </w:instrText>
         </w:r>
         <w:r>
           <w:rPr>
@@ -2299,7 +2308,7 @@
           <w:sz w:val="22"/>
         </w:rPr>
       </w:pPr>
-      <w:hyperlink w:anchor="_Toc236262439" w:history="1">
+      <w:hyperlink w:anchor="_Toc236263635" w:history="1">
         <w:r>
           <w:rPr>
             <w:rStyle w:val="Hyperlink"/>
@@ -2327,7 +2336,7 @@
             <w:noProof/>
             <w:webHidden/>
           </w:rPr>
-          <w:instrText xml:space="preserve"> PAGEREF _Toc236262439 \h </w:instrText>
+          <w:instrText xml:space="preserve"> PAGEREF _Toc236263635 \h </w:instrText>
         </w:r>
         <w:r>
           <w:rPr>
@@ -2370,7 +2379,7 @@
           <w:sz w:val="22"/>
         </w:rPr>
       </w:pPr>
-      <w:hyperlink w:anchor="_Toc236262440" w:history="1">
+      <w:hyperlink w:anchor="_Toc236263636" w:history="1">
         <w:r>
           <w:rPr>
             <w:rStyle w:val="Hyperlink"/>
@@ -2398,7 +2407,7 @@
             <w:noProof/>
             <w:webHidden/>
           </w:rPr>
-          <w:instrText xml:space="preserve"> PAGEREF _Toc236262440 \h </w:instrText>
+          <w:instrText xml:space="preserve"> PAGEREF _Toc236263636 \h </w:instrText>
         </w:r>
         <w:r>
           <w:rPr>
@@ -2441,7 +2450,7 @@
           <w:sz w:val="22"/>
         </w:rPr>
       </w:pPr>
-      <w:hyperlink w:anchor="_Toc236262441" w:history="1">
+      <w:hyperlink w:anchor="_Toc236263637" w:history="1">
         <w:r>
           <w:rPr>
             <w:rStyle w:val="Hyperlink"/>
@@ -2469,7 +2478,7 @@
             <w:noProof/>
             <w:webHidden/>
           </w:rPr>
-          <w:instrText xml:space="preserve"> PAGEREF _Toc236262441 \h </w:instrText>
+          <w:instrText xml:space="preserve"> PAGEREF _Toc236263637 \h </w:instrText>
         </w:r>
         <w:r>
           <w:rPr>
@@ -2512,7 +2521,7 @@
           <w:sz w:val="22"/>
         </w:rPr>
       </w:pPr>
-      <w:hyperlink w:anchor="_Toc236262442" w:history="1">
+      <w:hyperlink w:anchor="_Toc236263638" w:history="1">
         <w:r>
           <w:rPr>
             <w:rStyle w:val="Hyperlink"/>
@@ -2540,7 +2549,7 @@
             <w:noProof/>
             <w:webHidden/>
           </w:rPr>
-          <w:instrText xml:space="preserve"> PAGEREF _Toc236262442 \h </w:instrText>
+          <w:instrText xml:space="preserve"> PAGEREF _Toc236263638 \h </w:instrText>
         </w:r>
         <w:r>
           <w:rPr>
@@ -2583,7 +2592,7 @@
           <w:sz w:val="22"/>
         </w:rPr>
       </w:pPr>
-      <w:hyperlink w:anchor="_Toc236262443" w:history="1">
+      <w:hyperlink w:anchor="_Toc236263639" w:history="1">
         <w:r>
           <w:rPr>
             <w:rStyle w:val="Hyperlink"/>
@@ -2611,7 +2620,7 @@
             <w:noProof/>
             <w:webHidden/>
           </w:rPr>
-          <w:instrText xml:space="preserve"> PAGEREF _Toc236262443 \h </w:instrText>
+          <w:instrText xml:space="preserve"> PAGEREF _Toc236263639 \h </w:instrText>
         </w:r>
         <w:r>
           <w:rPr>
@@ -2654,7 +2663,7 @@
           <w:sz w:val="22"/>
         </w:rPr>
       </w:pPr>
-      <w:hyperlink w:anchor="_Toc236262444" w:history="1">
+      <w:hyperlink w:anchor="_Toc236263640" w:history="1">
         <w:r>
           <w:rPr>
             <w:rStyle w:val="Hyperlink"/>
@@ -2682,7 +2691,7 @@
             <w:noProof/>
             <w:webHidden/>
           </w:rPr>
-          <w:instrText xml:space="preserve"> PAGEREF _Toc236262444 \h </w:instrText>
+          <w:instrText xml:space="preserve"> PAGEREF _Toc236263640 \h </w:instrText>
         </w:r>
         <w:r>
           <w:rPr>
@@ -2725,7 +2734,7 @@
           <w:sz w:val="22"/>
         </w:rPr>
       </w:pPr>
-      <w:hyperlink w:anchor="_Toc236262445" w:history="1">
+      <w:hyperlink w:anchor="_Toc236263641" w:history="1">
         <w:r>
           <w:rPr>
             <w:rStyle w:val="Hyperlink"/>
@@ -2753,7 +2762,7 @@
             <w:noProof/>
             <w:webHidden/>
           </w:rPr>
-          <w:instrText xml:space="preserve"> PAGEREF _Toc236262445 \h </w:instrText>
+          <w:instrText xml:space="preserve"> PAGEREF _Toc236263641 \h </w:instrText>
         </w:r>
         <w:r>
           <w:rPr>
@@ -2796,7 +2805,7 @@
           <w:sz w:val="22"/>
         </w:rPr>
       </w:pPr>
-      <w:hyperlink w:anchor="_Toc236262446" w:history="1">
+      <w:hyperlink w:anchor="_Toc236263642" w:history="1">
         <w:r>
           <w:rPr>
             <w:rStyle w:val="Hyperlink"/>
@@ -2824,7 +2833,7 @@
             <w:noProof/>
             <w:webHidden/>
           </w:rPr>
-          <w:instrText xml:space="preserve"> PAGEREF _Toc236262446 \h </w:instrText>
+          <w:instrText xml:space="preserve"> PAGEREF _Toc236263642 \h </w:instrText>
         </w:r>
         <w:r>
           <w:rPr>
@@ -2867,7 +2876,7 @@
           <w:sz w:val="22"/>
         </w:rPr>
       </w:pPr>
-      <w:hyperlink w:anchor="_Toc236262447" w:history="1">
+      <w:hyperlink w:anchor="_Toc236263643" w:history="1">
         <w:r>
           <w:rPr>
             <w:rStyle w:val="Hyperlink"/>
@@ -2895,7 +2904,7 @@
             <w:noProof/>
             <w:webHidden/>
           </w:rPr>
-          <w:instrText xml:space="preserve"> PAGEREF _Toc236262447 \h </w:instrText>
+          <w:instrText xml:space="preserve"> PAGEREF _Toc236263643 \h </w:instrText>
         </w:r>
         <w:r>
           <w:rPr>
@@ -2938,7 +2947,7 @@
           <w:sz w:val="22"/>
         </w:rPr>
       </w:pPr>
-      <w:hyperlink w:anchor="_Toc236262448" w:history="1">
+      <w:hyperlink w:anchor="_Toc236263644" w:history="1">
         <w:r>
           <w:rPr>
             <w:rStyle w:val="Hyperlink"/>
@@ -2966,7 +2975,7 @@
             <w:noProof/>
             <w:webHidden/>
           </w:rPr>
-          <w:instrText xml:space="preserve"> PAGEREF _Toc236262448 \h </w:instrText>
+          <w:instrText xml:space="preserve"> PAGEREF _Toc236263644 \h </w:instrText>
         </w:r>
         <w:r>
           <w:rPr>
@@ -3009,7 +3018,7 @@
           <w:sz w:val="22"/>
         </w:rPr>
       </w:pPr>
-      <w:hyperlink w:anchor="_Toc236262449" w:history="1">
+      <w:hyperlink w:anchor="_Toc236263645" w:history="1">
         <w:r>
           <w:rPr>
             <w:rStyle w:val="Hyperlink"/>
@@ -3037,7 +3046,7 @@
             <w:noProof/>
             <w:webHidden/>
           </w:rPr>
-          <w:instrText xml:space="preserve"> PAGEREF _Toc236262449 \h </w:instrText>
+          <w:instrText xml:space="preserve"> PAGEREF _Toc236263645 \h </w:instrText>
         </w:r>
         <w:r>
           <w:rPr>
@@ -3080,7 +3089,7 @@
           <w:sz w:val="22"/>
         </w:rPr>
       </w:pPr>
-      <w:hyperlink w:anchor="_Toc236262450" w:history="1">
+      <w:hyperlink w:anchor="_Toc236263646" w:history="1">
         <w:r>
           <w:rPr>
             <w:rStyle w:val="Hyperlink"/>
@@ -3108,7 +3117,7 @@
             <w:noProof/>
             <w:webHidden/>
           </w:rPr>
-          <w:instrText xml:space="preserve"> PAGEREF _Toc236262450 \h </w:instrText>
+          <w:instrText xml:space="preserve"> PAGEREF _Toc236263646 \h </w:instrText>
         </w:r>
         <w:r>
           <w:rPr>
@@ -3151,7 +3160,7 @@
           <w:sz w:val="22"/>
         </w:rPr>
       </w:pPr>
-      <w:hyperlink w:anchor="_Toc236262451" w:history="1">
+      <w:hyperlink w:anchor="_Toc236263647" w:history="1">
         <w:r>
           <w:rPr>
             <w:rStyle w:val="Hyperlink"/>
@@ -3179,7 +3188,7 @@
             <w:noProof/>
             <w:webHidden/>
           </w:rPr>
-          <w:instrText xml:space="preserve"> PAGEREF _Toc236262451 \h </w:instrText>
+          <w:instrText xml:space="preserve"> PAGEREF _Toc236263647 \h </w:instrText>
         </w:r>
         <w:r>
           <w:rPr>
@@ -3222,7 +3231,7 @@
           <w:sz w:val="22"/>
         </w:rPr>
       </w:pPr>
-      <w:hyperlink w:anchor="_Toc236262452" w:history="1">
+      <w:hyperlink w:anchor="_Toc236263648" w:history="1">
         <w:r>
           <w:rPr>
             <w:rStyle w:val="Hyperlink"/>
@@ -3250,7 +3259,7 @@
             <w:noProof/>
             <w:webHidden/>
           </w:rPr>
-          <w:instrText xml:space="preserve"> PAGEREF _Toc236262452 \h </w:instrText>
+          <w:instrText xml:space="preserve"> PAGEREF _Toc236263648 \h </w:instrText>
         </w:r>
         <w:r>
           <w:rPr>
@@ -3293,7 +3302,7 @@
           <w:sz w:val="22"/>
         </w:rPr>
       </w:pPr>
-      <w:hyperlink w:anchor="_Toc236262453" w:history="1">
+      <w:hyperlink w:anchor="_Toc236263649" w:history="1">
         <w:r>
           <w:rPr>
             <w:rStyle w:val="Hyperlink"/>
@@ -3321,7 +3330,7 @@
             <w:noProof/>
             <w:webHidden/>
           </w:rPr>
-          <w:instrText xml:space="preserve"> PAGEREF _Toc236262453 \h </w:instrText>
+          <w:instrText xml:space="preserve"> PAGEREF _Toc236263649 \h </w:instrText>
         </w:r>
         <w:r>
           <w:rPr>
@@ -3364,7 +3373,7 @@
           <w:sz w:val="22"/>
         </w:rPr>
       </w:pPr>
-      <w:hyperlink w:anchor="_Toc236262454" w:history="1">
+      <w:hyperlink w:anchor="_Toc236263650" w:history="1">
         <w:r>
           <w:rPr>
             <w:rStyle w:val="Hyperlink"/>
@@ -3392,7 +3401,7 @@
             <w:noProof/>
             <w:webHidden/>
           </w:rPr>
-          <w:instrText xml:space="preserve"> PAGEREF _Toc236262454 \h </w:instrText>
+          <w:instrText xml:space="preserve"> PAGEREF _Toc236263650 \h </w:instrText>
         </w:r>
         <w:r>
           <w:rPr>
@@ -3435,7 +3444,7 @@
           <w:sz w:val="22"/>
         </w:rPr>
       </w:pPr>
-      <w:hyperlink w:anchor="_Toc236262455" w:history="1">
+      <w:hyperlink w:anchor="_Toc236263651" w:history="1">
         <w:r>
           <w:rPr>
             <w:rStyle w:val="Hyperlink"/>
@@ -3463,7 +3472,7 @@
             <w:noProof/>
             <w:webHidden/>
           </w:rPr>
-          <w:instrText xml:space="preserve"> PAGEREF _Toc236262455 \h </w:instrText>
+          <w:instrText xml:space="preserve"> PAGEREF _Toc236263651 \h </w:instrText>
         </w:r>
         <w:r>
           <w:rPr>
@@ -3506,7 +3515,7 @@
           <w:sz w:val="22"/>
         </w:rPr>
       </w:pPr>
-      <w:hyperlink w:anchor="_Toc236262456" w:history="1">
+      <w:hyperlink w:anchor="_Toc236263652" w:history="1">
         <w:r>
           <w:rPr>
             <w:rStyle w:val="Hyperlink"/>
@@ -3534,7 +3543,7 @@
             <w:noProof/>
             <w:webHidden/>
           </w:rPr>
-          <w:instrText xml:space="preserve"> PAGEREF _Toc236262456 \h </w:instrText>
+          <w:instrText xml:space="preserve"> PAGEREF _Toc236263652 \h </w:instrText>
         </w:r>
         <w:r>
           <w:rPr>
@@ -3577,7 +3586,7 @@
           <w:sz w:val="22"/>
         </w:rPr>
       </w:pPr>
-      <w:hyperlink w:anchor="_Toc236262457" w:history="1">
+      <w:hyperlink w:anchor="_Toc236263653" w:history="1">
         <w:r>
           <w:rPr>
             <w:rStyle w:val="Hyperlink"/>
@@ -3605,7 +3614,7 @@
             <w:noProof/>
             <w:webHidden/>
           </w:rPr>
-          <w:instrText xml:space="preserve"> PAGEREF _Toc236262457 \h </w:instrText>
+          <w:instrText xml:space="preserve"> PAGEREF _Toc236263653 \h </w:instrText>
         </w:r>
         <w:r>
           <w:rPr>
@@ -3648,7 +3657,7 @@
           <w:sz w:val="22"/>
         </w:rPr>
       </w:pPr>
-      <w:hyperlink w:anchor="_Toc236262458" w:history="1">
+      <w:hyperlink w:anchor="_Toc236263654" w:history="1">
         <w:r>
           <w:rPr>
             <w:rStyle w:val="Hyperlink"/>
@@ -3676,7 +3685,7 @@
             <w:noProof/>
             <w:webHidden/>
           </w:rPr>
-          <w:instrText xml:space="preserve"> PAGEREF _Toc236262458 \h </w:instrText>
+          <w:instrText xml:space="preserve"> PAGEREF _Toc236263654 \h </w:instrText>
         </w:r>
         <w:r>
           <w:rPr>
@@ -3719,7 +3728,7 @@
           <w:sz w:val="22"/>
         </w:rPr>
       </w:pPr>
-      <w:hyperlink w:anchor="_Toc236262459" w:history="1">
+      <w:hyperlink w:anchor="_Toc236263655" w:history="1">
         <w:r>
           <w:rPr>
             <w:rStyle w:val="Hyperlink"/>
@@ -3747,7 +3756,7 @@
             <w:noProof/>
             <w:webHidden/>
           </w:rPr>
-          <w:instrText xml:space="preserve"> PAGEREF _Toc236262459 \h </w:instrText>
+          <w:instrText xml:space="preserve"> PAGEREF _Toc236263655 \h </w:instrText>
         </w:r>
         <w:r>
           <w:rPr>
@@ -3790,7 +3799,7 @@
           <w:sz w:val="22"/>
         </w:rPr>
       </w:pPr>
-      <w:hyperlink w:anchor="_Toc236262460" w:history="1">
+      <w:hyperlink w:anchor="_Toc236263656" w:history="1">
         <w:r>
           <w:rPr>
             <w:rStyle w:val="Hyperlink"/>
@@ -3818,7 +3827,7 @@
             <w:noProof/>
             <w:webHidden/>
           </w:rPr>
-          <w:instrText xml:space="preserve"> PAGEREF _Toc236262460 \h </w:instrText>
+          <w:instrText xml:space="preserve"> PAGEREF _Toc236263656 \h </w:instrText>
         </w:r>
         <w:r>
           <w:rPr>
@@ -3861,7 +3870,7 @@
           <w:sz w:val="22"/>
         </w:rPr>
       </w:pPr>
-      <w:hyperlink w:anchor="_Toc236262461" w:history="1">
+      <w:hyperlink w:anchor="_Toc236263657" w:history="1">
         <w:r>
           <w:rPr>
             <w:rStyle w:val="Hyperlink"/>
@@ -3889,7 +3898,7 @@
             <w:noProof/>
             <w:webHidden/>
           </w:rPr>
-          <w:instrText xml:space="preserve"> PAGEREF _Toc236262461 \h </w:instrText>
+          <w:instrText xml:space="preserve"> PAGEREF _Toc236263657 \h </w:instrText>
         </w:r>
         <w:r>
           <w:rPr>
@@ -3932,7 +3941,7 @@
           <w:sz w:val="22"/>
         </w:rPr>
       </w:pPr>
-      <w:hyperlink w:anchor="_Toc236262462" w:history="1">
+      <w:hyperlink w:anchor="_Toc236263658" w:history="1">
         <w:r>
           <w:rPr>
             <w:rStyle w:val="Hyperlink"/>
@@ -3960,7 +3969,7 @@
             <w:noProof/>
             <w:webHidden/>
           </w:rPr>
-          <w:instrText xml:space="preserve"> PAGEREF _Toc236262462 \h </w:instrText>
+          <w:instrText xml:space="preserve"> PAGEREF _Toc236263658 \h </w:instrText>
         </w:r>
         <w:r>
           <w:rPr>
@@ -4003,7 +4012,7 @@
           <w:sz w:val="22"/>
         </w:rPr>
       </w:pPr>
-      <w:hyperlink w:anchor="_Toc236262463" w:history="1">
+      <w:hyperlink w:anchor="_Toc236263659" w:history="1">
         <w:r>
           <w:rPr>
             <w:rStyle w:val="Hyperlink"/>
@@ -4031,7 +4040,7 @@
             <w:noProof/>
             <w:webHidden/>
           </w:rPr>
-          <w:instrText xml:space="preserve"> PAGEREF _Toc236262463 \h </w:instrText>
+          <w:instrText xml:space="preserve"> PAGEREF _Toc236263659 \h </w:instrText>
         </w:r>
         <w:r>
           <w:rPr>
@@ -4074,7 +4083,7 @@
           <w:sz w:val="22"/>
         </w:rPr>
       </w:pPr>
-      <w:hyperlink w:anchor="_Toc236262464" w:history="1">
+      <w:hyperlink w:anchor="_Toc236263660" w:history="1">
         <w:r>
           <w:rPr>
             <w:rStyle w:val="Hyperlink"/>
@@ -4102,7 +4111,7 @@
             <w:noProof/>
             <w:webHidden/>
           </w:rPr>
-          <w:instrText xml:space="preserve"> PAGEREF _Toc236262464 \h </w:instrText>
+          <w:instrText xml:space="preserve"> PAGEREF _Toc236263660 \h </w:instrText>
         </w:r>
         <w:r>
           <w:rPr>
@@ -4145,7 +4154,7 @@
           <w:sz w:val="22"/>
         </w:rPr>
       </w:pPr>
-      <w:hyperlink w:anchor="_Toc236262465" w:history="1">
+      <w:hyperlink w:anchor="_Toc236263661" w:history="1">
         <w:r>
           <w:rPr>
             <w:rStyle w:val="Hyperlink"/>
@@ -4173,7 +4182,7 @@
             <w:noProof/>
             <w:webHidden/>
           </w:rPr>
-          <w:instrText xml:space="preserve"> PAGEREF _Toc236262465 \h </w:instrText>
+          <w:instrText xml:space="preserve"> PAGEREF _Toc236263661 \h </w:instrText>
         </w:r>
         <w:r>
           <w:rPr>
@@ -4216,7 +4225,7 @@
           <w:sz w:val="22"/>
         </w:rPr>
       </w:pPr>
-      <w:hyperlink w:anchor="_Toc236262466" w:history="1">
+      <w:hyperlink w:anchor="_Toc236263662" w:history="1">
         <w:r>
           <w:rPr>
             <w:rStyle w:val="Hyperlink"/>
@@ -4244,7 +4253,7 @@
             <w:noProof/>
             <w:webHidden/>
           </w:rPr>
-          <w:instrText xml:space="preserve"> PAGEREF _Toc236262466 \h </w:instrText>
+          <w:instrText xml:space="preserve"> PAGEREF _Toc236263662 \h </w:instrText>
         </w:r>
         <w:r>
           <w:rPr>
@@ -4287,7 +4296,7 @@
           <w:sz w:val="22"/>
         </w:rPr>
       </w:pPr>
-      <w:hyperlink w:anchor="_Toc236262467" w:history="1">
+      <w:hyperlink w:anchor="_Toc236263663" w:history="1">
         <w:r>
           <w:rPr>
             <w:rStyle w:val="Hyperlink"/>
@@ -4315,7 +4324,7 @@
             <w:noProof/>
             <w:webHidden/>
           </w:rPr>
-          <w:instrText xml:space="preserve"> PAGEREF _Toc236262467 \h </w:instrText>
+          <w:instrText xml:space="preserve"> PAGEREF _Toc236263663 \h </w:instrText>
         </w:r>
         <w:r>
           <w:rPr>
@@ -4358,7 +4367,7 @@
           <w:sz w:val="22"/>
         </w:rPr>
       </w:pPr>
-      <w:hyperlink w:anchor="_Toc236262468" w:history="1">
+      <w:hyperlink w:anchor="_Toc236263664" w:history="1">
         <w:r>
           <w:rPr>
             <w:rStyle w:val="Hyperlink"/>
@@ -4386,7 +4395,7 @@
             <w:noProof/>
             <w:webHidden/>
           </w:rPr>
-          <w:instrText xml:space="preserve"> PAGEREF _Toc236262468 \h </w:instrText>
+          <w:instrText xml:space="preserve"> PAGEREF _Toc236263664 \h </w:instrText>
         </w:r>
         <w:r>
           <w:rPr>
@@ -4429,7 +4438,7 @@
           <w:sz w:val="22"/>
         </w:rPr>
       </w:pPr>
-      <w:hyperlink w:anchor="_Toc236262469" w:history="1">
+      <w:hyperlink w:anchor="_Toc236263665" w:history="1">
         <w:r>
           <w:rPr>
             <w:rStyle w:val="Hyperlink"/>
@@ -4457,7 +4466,7 @@
             <w:noProof/>
             <w:webHidden/>
           </w:rPr>
-          <w:instrText xml:space="preserve"> PAGEREF _Toc236262469 \h </w:instrText>
+          <w:instrText xml:space="preserve"> PAGEREF _Toc236263665 \h </w:instrText>
         </w:r>
         <w:r>
           <w:rPr>
@@ -4500,7 +4509,7 @@
           <w:sz w:val="22"/>
         </w:rPr>
       </w:pPr>
-      <w:hyperlink w:anchor="_Toc236262470" w:history="1">
+      <w:hyperlink w:anchor="_Toc236263666" w:history="1">
         <w:r>
           <w:rPr>
             <w:rStyle w:val="Hyperlink"/>
@@ -4528,7 +4537,7 @@
             <w:noProof/>
             <w:webHidden/>
           </w:rPr>
-          <w:instrText xml:space="preserve"> PAGEREF _Toc236262470 \h </w:instrText>
+          <w:instrText xml:space="preserve"> PAGEREF _Toc236263666 \h </w:instrText>
         </w:r>
         <w:r>
           <w:rPr>
@@ -4571,7 +4580,7 @@
           <w:sz w:val="22"/>
         </w:rPr>
       </w:pPr>
-      <w:hyperlink w:anchor="_Toc236262471" w:history="1">
+      <w:hyperlink w:anchor="_Toc236263667" w:history="1">
         <w:r>
           <w:rPr>
             <w:rStyle w:val="Hyperlink"/>
@@ -4599,7 +4608,7 @@
             <w:noProof/>
             <w:webHidden/>
           </w:rPr>
-          <w:instrText xml:space="preserve"> PAGEREF _Toc236262471 \h </w:instrText>
+          <w:instrText xml:space="preserve"> PAGEREF _Toc236263667 \h </w:instrText>
         </w:r>
         <w:r>
           <w:rPr>
@@ -4642,7 +4651,7 @@
           <w:sz w:val="22"/>
         </w:rPr>
       </w:pPr>
-      <w:hyperlink w:anchor="_Toc236262472" w:history="1">
+      <w:hyperlink w:anchor="_Toc236263668" w:history="1">
         <w:r>
           <w:rPr>
             <w:rStyle w:val="Hyperlink"/>
@@ -4670,7 +4679,7 @@
             <w:noProof/>
             <w:webHidden/>
           </w:rPr>
-          <w:instrText xml:space="preserve"> PAGEREF _Toc236262472 \h </w:instrText>
+          <w:instrText xml:space="preserve"> PAGEREF _Toc236263668 \h </w:instrText>
         </w:r>
         <w:r>
           <w:rPr>
@@ -4713,7 +4722,7 @@
           <w:sz w:val="22"/>
         </w:rPr>
       </w:pPr>
-      <w:hyperlink w:anchor="_Toc236262473" w:history="1">
+      <w:hyperlink w:anchor="_Toc236263669" w:history="1">
         <w:r>
           <w:rPr>
             <w:rStyle w:val="Hyperlink"/>
@@ -4741,7 +4750,7 @@
             <w:noProof/>
             <w:webHidden/>
           </w:rPr>
-          <w:instrText xml:space="preserve"> PAGEREF _Toc236262473 \h </w:instrText>
+          <w:instrText xml:space="preserve"> PAGEREF _Toc236263669 \h </w:instrText>
         </w:r>
         <w:r>
           <w:rPr>
@@ -4784,7 +4793,7 @@
           <w:sz w:val="22"/>
         </w:rPr>
       </w:pPr>
-      <w:hyperlink w:anchor="_Toc236262474" w:history="1">
+      <w:hyperlink w:anchor="_Toc236263670" w:history="1">
         <w:r>
           <w:rPr>
             <w:rStyle w:val="Hyperlink"/>
@@ -4812,7 +4821,7 @@
             <w:noProof/>
             <w:webHidden/>
           </w:rPr>
-          <w:instrText xml:space="preserve"> PAGEREF _Toc236262474 \h </w:instrText>
+          <w:instrText xml:space="preserve"> PAGEREF _Toc236263670 \h </w:instrText>
         </w:r>
         <w:r>
           <w:rPr>
@@ -4855,7 +4864,7 @@
           <w:sz w:val="22"/>
         </w:rPr>
       </w:pPr>
-      <w:hyperlink w:anchor="_Toc236262475" w:history="1">
+      <w:hyperlink w:anchor="_Toc236263671" w:history="1">
         <w:r>
           <w:rPr>
             <w:rStyle w:val="Hyperlink"/>
@@ -4883,7 +4892,7 @@
             <w:noProof/>
             <w:webHidden/>
           </w:rPr>
-          <w:instrText xml:space="preserve"> PAGEREF _Toc236262475 \h </w:instrText>
+          <w:instrText xml:space="preserve"> PAGEREF _Toc236263671 \h </w:instrText>
         </w:r>
         <w:r>
           <w:rPr>
@@ -4926,7 +4935,7 @@
           <w:sz w:val="22"/>
         </w:rPr>
       </w:pPr>
-      <w:hyperlink w:anchor="_Toc236262476" w:history="1">
+      <w:hyperlink w:anchor="_Toc236263672" w:history="1">
         <w:r>
           <w:rPr>
             <w:rStyle w:val="Hyperlink"/>
@@ -4954,7 +4963,7 @@
             <w:noProof/>
             <w:webHidden/>
           </w:rPr>
-          <w:instrText xml:space="preserve"> PAGEREF _Toc236262476 \h </w:instrText>
+          <w:instrText xml:space="preserve"> PAGEREF _Toc236263672 \h </w:instrText>
         </w:r>
         <w:r>
           <w:rPr>
@@ -4997,7 +5006,7 @@
           <w:sz w:val="22"/>
         </w:rPr>
       </w:pPr>
-      <w:hyperlink w:anchor="_Toc236262477" w:history="1">
+      <w:hyperlink w:anchor="_Toc236263673" w:history="1">
         <w:r>
           <w:rPr>
             <w:rStyle w:val="Hyperlink"/>
@@ -5025,7 +5034,7 @@
             <w:noProof/>
             <w:webHidden/>
           </w:rPr>
-          <w:instrText xml:space="preserve"> PAGEREF _Toc236262477 \h </w:instrText>
+          <w:instrText xml:space="preserve"> PAGEREF _Toc236263673 \h </w:instrText>
         </w:r>
         <w:r>
           <w:rPr>
@@ -5068,7 +5077,7 @@
           <w:sz w:val="22"/>
         </w:rPr>
       </w:pPr>
-      <w:hyperlink w:anchor="_Toc236262478" w:history="1">
+      <w:hyperlink w:anchor="_Toc236263674" w:history="1">
         <w:r>
           <w:rPr>
             <w:rStyle w:val="Hyperlink"/>
@@ -5096,7 +5105,7 @@
             <w:noProof/>
             <w:webHidden/>
           </w:rPr>
-          <w:instrText xml:space="preserve"> PAGEREF _Toc236262478 \h </w:instrText>
+          <w:instrText xml:space="preserve"> PAGEREF _Toc236263674 \h </w:instrText>
         </w:r>
         <w:r>
           <w:rPr>
@@ -5139,7 +5148,7 @@
           <w:sz w:val="22"/>
         </w:rPr>
       </w:pPr>
-      <w:hyperlink w:anchor="_Toc236262479" w:history="1">
+      <w:hyperlink w:anchor="_Toc236263675" w:history="1">
         <w:r>
           <w:rPr>
             <w:rStyle w:val="Hyperlink"/>
@@ -5167,7 +5176,7 @@
             <w:noProof/>
             <w:webHidden/>
           </w:rPr>
-          <w:instrText xml:space="preserve"> PAGEREF _Toc236262479 \h </w:instrText>
+          <w:instrText xml:space="preserve"> PAGEREF _Toc236263675 \h </w:instrText>
         </w:r>
         <w:r>
           <w:rPr>
@@ -5210,7 +5219,7 @@
           <w:sz w:val="22"/>
         </w:rPr>
       </w:pPr>
-      <w:hyperlink w:anchor="_Toc236262480" w:history="1">
+      <w:hyperlink w:anchor="_Toc236263676" w:history="1">
         <w:r>
           <w:rPr>
             <w:rStyle w:val="Hyperlink"/>
@@ -5238,7 +5247,7 @@
             <w:noProof/>
             <w:webHidden/>
           </w:rPr>
-          <w:instrText xml:space="preserve"> PAGEREF _Toc236262480 \h </w:instrText>
+          <w:instrText xml:space="preserve"> PAGEREF _Toc236263676 \h </w:instrText>
         </w:r>
         <w:r>
           <w:rPr>
@@ -5281,7 +5290,7 @@
           <w:sz w:val="22"/>
         </w:rPr>
       </w:pPr>
-      <w:hyperlink w:anchor="_Toc236262481" w:history="1">
+      <w:hyperlink w:anchor="_Toc236263677" w:history="1">
         <w:r>
           <w:rPr>
             <w:rStyle w:val="Hyperlink"/>
@@ -5309,7 +5318,7 @@
             <w:noProof/>
             <w:webHidden/>
           </w:rPr>
-          <w:instrText xml:space="preserve"> PAGEREF _Toc236262481 \h </w:instrText>
+          <w:instrText xml:space="preserve"> PAGEREF _Toc236263677 \h </w:instrText>
         </w:r>
         <w:r>
           <w:rPr>
@@ -5352,7 +5361,7 @@
           <w:sz w:val="22"/>
         </w:rPr>
       </w:pPr>
-      <w:hyperlink w:anchor="_Toc236262482" w:history="1">
+      <w:hyperlink w:anchor="_Toc236263678" w:history="1">
         <w:r>
           <w:rPr>
             <w:rStyle w:val="Hyperlink"/>
@@ -5380,7 +5389,7 @@
             <w:noProof/>
             <w:webHidden/>
           </w:rPr>
-          <w:instrText xml:space="preserve"> PAGEREF _Toc236262482 \h </w:instrText>
+          <w:instrText xml:space="preserve"> PAGEREF _Toc236263678 \h </w:instrText>
         </w:r>
         <w:r>
           <w:rPr>
@@ -5423,7 +5432,7 @@
           <w:sz w:val="22"/>
         </w:rPr>
       </w:pPr>
-      <w:hyperlink w:anchor="_Toc236262483" w:history="1">
+      <w:hyperlink w:anchor="_Toc236263679" w:history="1">
         <w:r>
           <w:rPr>
             <w:rStyle w:val="Hyperlink"/>
@@ -5451,7 +5460,7 @@
             <w:noProof/>
             <w:webHidden/>
           </w:rPr>
-          <w:instrText xml:space="preserve"> PAGEREF _Toc236262483 \h </w:instrText>
+          <w:instrText xml:space="preserve"> PAGEREF _Toc236263679 \h </w:instrText>
         </w:r>
         <w:r>
           <w:rPr>
@@ -5494,7 +5503,7 @@
           <w:sz w:val="22"/>
         </w:rPr>
       </w:pPr>
-      <w:hyperlink w:anchor="_Toc236262484" w:history="1">
+      <w:hyperlink w:anchor="_Toc236263680" w:history="1">
         <w:r>
           <w:rPr>
             <w:rStyle w:val="Hyperlink"/>
@@ -5522,7 +5531,7 @@
             <w:noProof/>
             <w:webHidden/>
           </w:rPr>
-          <w:instrText xml:space="preserve"> PAGEREF _Toc236262484 \h </w:instrText>
+          <w:instrText xml:space="preserve"> PAGEREF _Toc236263680 \h </w:instrText>
         </w:r>
         <w:r>
           <w:rPr>
@@ -5565,7 +5574,7 @@
           <w:sz w:val="22"/>
         </w:rPr>
       </w:pPr>
-      <w:hyperlink w:anchor="_Toc236262485" w:history="1">
+      <w:hyperlink w:anchor="_Toc236263681" w:history="1">
         <w:r>
           <w:rPr>
             <w:rStyle w:val="Hyperlink"/>
@@ -5593,7 +5602,7 @@
             <w:noProof/>
             <w:webHidden/>
           </w:rPr>
-          <w:instrText xml:space="preserve"> PAGEREF _Toc236262485 \h </w:instrText>
+          <w:instrText xml:space="preserve"> PAGEREF _Toc236263681 \h </w:instrText>
         </w:r>
         <w:r>
           <w:rPr>
@@ -5636,7 +5645,7 @@
           <w:sz w:val="22"/>
         </w:rPr>
       </w:pPr>
-      <w:hyperlink w:anchor="_Toc236262486" w:history="1">
+      <w:hyperlink w:anchor="_Toc236263682" w:history="1">
         <w:r>
           <w:rPr>
             <w:rStyle w:val="Hyperlink"/>
@@ -5664,7 +5673,7 @@
             <w:noProof/>
             <w:webHidden/>
           </w:rPr>
-          <w:instrText xml:space="preserve"> PAGEREF _Toc236262486 \h </w:instrText>
+          <w:instrText xml:space="preserve"> PAGEREF _Toc236263682 \h </w:instrText>
         </w:r>
         <w:r>
           <w:rPr>
@@ -5707,7 +5716,7 @@
           <w:sz w:val="22"/>
         </w:rPr>
       </w:pPr>
-      <w:hyperlink w:anchor="_Toc236262487" w:history="1">
+      <w:hyperlink w:anchor="_Toc236263683" w:history="1">
         <w:r>
           <w:rPr>
             <w:rStyle w:val="Hyperlink"/>
@@ -5735,7 +5744,7 @@
             <w:noProof/>
             <w:webHidden/>
           </w:rPr>
-          <w:instrText xml:space="preserve"> PAGEREF _Toc236262487 \h </w:instrText>
+          <w:instrText xml:space="preserve"> PAGEREF _Toc236263683 \h </w:instrText>
         </w:r>
         <w:r>
           <w:rPr>
@@ -5778,7 +5787,7 @@
           <w:sz w:val="22"/>
         </w:rPr>
       </w:pPr>
-      <w:hyperlink w:anchor="_Toc236262488" w:history="1">
+      <w:hyperlink w:anchor="_Toc236263684" w:history="1">
         <w:r>
           <w:rPr>
             <w:rStyle w:val="Hyperlink"/>
@@ -5806,7 +5815,7 @@
             <w:noProof/>
             <w:webHidden/>
           </w:rPr>
-          <w:instrText xml:space="preserve"> PAGEREF _Toc236262488 \h </w:instrText>
+          <w:instrText xml:space="preserve"> PAGEREF _Toc236263684 \h </w:instrText>
         </w:r>
         <w:r>
           <w:rPr>
@@ -5849,7 +5858,7 @@
           <w:sz w:val="22"/>
         </w:rPr>
       </w:pPr>
-      <w:hyperlink w:anchor="_Toc236262489" w:history="1">
+      <w:hyperlink w:anchor="_Toc236263685" w:history="1">
         <w:r>
           <w:rPr>
             <w:rStyle w:val="Hyperlink"/>
@@ -5877,7 +5886,7 @@
             <w:noProof/>
             <w:webHidden/>
           </w:rPr>
-          <w:instrText xml:space="preserve"> PAGEREF _Toc236262489 \h </w:instrText>
+          <w:instrText xml:space="preserve"> PAGEREF _Toc236263685 \h </w:instrText>
         </w:r>
         <w:r>
           <w:rPr>
@@ -5920,7 +5929,7 @@
           <w:sz w:val="22"/>
         </w:rPr>
       </w:pPr>
-      <w:hyperlink w:anchor="_Toc236262490" w:history="1">
+      <w:hyperlink w:anchor="_Toc236263686" w:history="1">
         <w:r>
           <w:rPr>
             <w:rStyle w:val="Hyperlink"/>
@@ -5948,7 +5957,7 @@
             <w:noProof/>
             <w:webHidden/>
           </w:rPr>
-          <w:instrText xml:space="preserve"> PAGEREF _Toc236262490 \h </w:instrText>
+          <w:instrText xml:space="preserve"> PAGEREF _Toc236263686 \h </w:instrText>
         </w:r>
         <w:r>
           <w:rPr>
@@ -5991,7 +6000,7 @@
           <w:sz w:val="22"/>
         </w:rPr>
       </w:pPr>
-      <w:hyperlink w:anchor="_Toc236262491" w:history="1">
+      <w:hyperlink w:anchor="_Toc236263687" w:history="1">
         <w:r>
           <w:rPr>
             <w:rStyle w:val="Hyperlink"/>
@@ -6019,7 +6028,7 @@
             <w:noProof/>
             <w:webHidden/>
           </w:rPr>
-          <w:instrText xml:space="preserve"> PAGEREF _Toc236262491 \h </w:instrText>
+          <w:instrText xml:space="preserve"> PAGEREF _Toc236263687 \h </w:instrText>
         </w:r>
         <w:r>
           <w:rPr>
@@ -6062,7 +6071,7 @@
           <w:sz w:val="22"/>
         </w:rPr>
       </w:pPr>
-      <w:hyperlink w:anchor="_Toc236262492" w:history="1">
+      <w:hyperlink w:anchor="_Toc236263688" w:history="1">
         <w:r>
           <w:rPr>
             <w:rStyle w:val="Hyperlink"/>
@@ -6090,7 +6099,7 @@
             <w:noProof/>
             <w:webHidden/>
           </w:rPr>
-          <w:instrText xml:space="preserve"> PAGEREF _Toc236262492 \h </w:instrText>
+          <w:instrText xml:space="preserve"> PAGEREF _Toc236263688 \h </w:instrText>
         </w:r>
         <w:r>
           <w:rPr>
@@ -6133,7 +6142,7 @@
           <w:sz w:val="22"/>
         </w:rPr>
       </w:pPr>
-      <w:hyperlink w:anchor="_Toc236262493" w:history="1">
+      <w:hyperlink w:anchor="_Toc236263689" w:history="1">
         <w:r>
           <w:rPr>
             <w:rStyle w:val="Hyperlink"/>
@@ -6161,7 +6170,7 @@
             <w:noProof/>
             <w:webHidden/>
           </w:rPr>
-          <w:instrText xml:space="preserve"> PAGEREF _Toc236262493 \h </w:instrText>
+          <w:instrText xml:space="preserve"> PAGEREF _Toc236263689 \h </w:instrText>
         </w:r>
         <w:r>
           <w:rPr>
@@ -6204,7 +6213,7 @@
           <w:sz w:val="22"/>
         </w:rPr>
       </w:pPr>
-      <w:hyperlink w:anchor="_Toc236262494" w:history="1">
+      <w:hyperlink w:anchor="_Toc236263690" w:history="1">
         <w:r>
           <w:rPr>
             <w:rStyle w:val="Hyperlink"/>
@@ -6232,7 +6241,7 @@
             <w:noProof/>
             <w:webHidden/>
           </w:rPr>
-          <w:instrText xml:space="preserve"> PAGEREF _Toc236262494 \h </w:instrText>
+          <w:instrText xml:space="preserve"> PAGEREF _Toc236263690 \h </w:instrText>
         </w:r>
         <w:r>
           <w:rPr>
@@ -6275,7 +6284,7 @@
           <w:sz w:val="22"/>
         </w:rPr>
       </w:pPr>
-      <w:hyperlink w:anchor="_Toc236262495" w:history="1">
+      <w:hyperlink w:anchor="_Toc236263691" w:history="1">
         <w:r>
           <w:rPr>
             <w:rStyle w:val="Hyperlink"/>
@@ -6303,7 +6312,7 @@
             <w:noProof/>
             <w:webHidden/>
           </w:rPr>
-          <w:instrText xml:space="preserve"> PAGEREF _Toc236262495 \h </w:instrText>
+          <w:instrText xml:space="preserve"> PAGEREF _Toc236263691 \h </w:instrText>
         </w:r>
         <w:r>
           <w:rPr>
@@ -6346,7 +6355,7 @@
           <w:sz w:val="22"/>
         </w:rPr>
       </w:pPr>
-      <w:hyperlink w:anchor="_Toc236262496" w:history="1">
+      <w:hyperlink w:anchor="_Toc236263692" w:history="1">
         <w:r>
           <w:rPr>
             <w:rStyle w:val="Hyperlink"/>
@@ -6374,7 +6383,7 @@
             <w:noProof/>
             <w:webHidden/>
           </w:rPr>
-          <w:instrText xml:space="preserve"> PAGEREF _Toc236262496 \h </w:instrText>
+          <w:instrText xml:space="preserve"> PAGEREF _Toc236263692 \h </w:instrText>
         </w:r>
         <w:r>
           <w:rPr>
@@ -6417,7 +6426,7 @@
           <w:sz w:val="22"/>
         </w:rPr>
       </w:pPr>
-      <w:hyperlink w:anchor="_Toc236262497" w:history="1">
+      <w:hyperlink w:anchor="_Toc236263693" w:history="1">
         <w:r>
           <w:rPr>
             <w:rStyle w:val="Hyperlink"/>
@@ -6445,7 +6454,7 @@
             <w:noProof/>
             <w:webHidden/>
           </w:rPr>
-          <w:instrText xml:space="preserve"> PAGEREF _Toc236262497 \h </w:instrText>
+          <w:instrText xml:space="preserve"> PAGEREF _Toc236263693 \h </w:instrText>
         </w:r>
         <w:r>
           <w:rPr>
@@ -6488,7 +6497,7 @@
           <w:sz w:val="22"/>
         </w:rPr>
       </w:pPr>
-      <w:hyperlink w:anchor="_Toc236262498" w:history="1">
+      <w:hyperlink w:anchor="_Toc236263694" w:history="1">
         <w:r>
           <w:rPr>
             <w:rStyle w:val="Hyperlink"/>
@@ -6516,7 +6525,7 @@
             <w:noProof/>
             <w:webHidden/>
           </w:rPr>
-          <w:instrText xml:space="preserve"> PAGEREF _Toc236262498 \h </w:instrText>
+          <w:instrText xml:space="preserve"> PAGEREF _Toc236263694 \h </w:instrText>
         </w:r>
         <w:r>
           <w:rPr>
@@ -6559,7 +6568,7 @@
           <w:sz w:val="22"/>
         </w:rPr>
       </w:pPr>
-      <w:hyperlink w:anchor="_Toc236262499" w:history="1">
+      <w:hyperlink w:anchor="_Toc236263695" w:history="1">
         <w:r>
           <w:rPr>
             <w:rStyle w:val="Hyperlink"/>
@@ -6587,7 +6596,7 @@
             <w:noProof/>
             <w:webHidden/>
           </w:rPr>
-          <w:instrText xml:space="preserve"> PAGEREF _Toc236262499 \h </w:instrText>
+          <w:instrText xml:space="preserve"> PAGEREF _Toc236263695 \h </w:instrText>
         </w:r>
         <w:r>
           <w:rPr>
@@ -6704,7 +6713,7 @@
       <w:pPr>
         <w:pStyle w:val="TableCaption"/>
       </w:pPr>
-      <w:bookmarkStart w:id="2" w:name="_Toc236262501"/>
+      <w:bookmarkStart w:id="2" w:name="_Toc236263697"/>
       <w:r>
         <w:rPr>
           <w:lang w:val="vi-VN" w:eastAsia="vi-VN"/>
@@ -7876,7 +7885,7 @@
         </w:rPr>
         <w:fldChar w:fldCharType="separate"/>
       </w:r>
-      <w:hyperlink w:anchor="_Toc236262500" w:history="1">
+      <w:hyperlink w:anchor="_Toc236263696" w:history="1">
         <w:r>
           <w:rPr>
             <w:rStyle w:val="Hyperlink"/>
@@ -7905,7 +7914,7 @@
             <w:noProof/>
             <w:webHidden/>
           </w:rPr>
-          <w:instrText xml:space="preserve"> PAGEREF _Toc236262500 \h </w:instrText>
+          <w:instrText xml:space="preserve"> PAGEREF _Toc236263696 \h </w:instrText>
         </w:r>
         <w:r>
           <w:rPr>
@@ -7948,7 +7957,7 @@
           <w:sz w:val="22"/>
         </w:rPr>
       </w:pPr>
-      <w:hyperlink w:anchor="_Toc236262501" w:history="1">
+      <w:hyperlink w:anchor="_Toc236263697" w:history="1">
         <w:r>
           <w:rPr>
             <w:rStyle w:val="Hyperlink"/>
@@ -7977,7 +7986,7 @@
             <w:noProof/>
             <w:webHidden/>
           </w:rPr>
-          <w:instrText xml:space="preserve"> PAGEREF _Toc236262501 \h </w:instrText>
+          <w:instrText xml:space="preserve"> PAGEREF _Toc236263697 \h </w:instrText>
         </w:r>
         <w:r>
           <w:rPr>
@@ -8020,7 +8029,7 @@
           <w:sz w:val="22"/>
         </w:rPr>
       </w:pPr>
-      <w:hyperlink w:anchor="_Toc236262502" w:history="1">
+      <w:hyperlink w:anchor="_Toc236263698" w:history="1">
         <w:r>
           <w:rPr>
             <w:rStyle w:val="Hyperlink"/>
@@ -8049,7 +8058,7 @@
             <w:noProof/>
             <w:webHidden/>
           </w:rPr>
-          <w:instrText xml:space="preserve"> PAGEREF _Toc236262502 \h </w:instrText>
+          <w:instrText xml:space="preserve"> PAGEREF _Toc236263698 \h </w:instrText>
         </w:r>
         <w:r>
           <w:rPr>
@@ -8092,7 +8101,7 @@
           <w:sz w:val="22"/>
         </w:rPr>
       </w:pPr>
-      <w:hyperlink w:anchor="_Toc236262503" w:history="1">
+      <w:hyperlink w:anchor="_Toc236263699" w:history="1">
         <w:r>
           <w:rPr>
             <w:rStyle w:val="Hyperlink"/>
@@ -8121,7 +8130,7 @@
             <w:noProof/>
             <w:webHidden/>
           </w:rPr>
-          <w:instrText xml:space="preserve"> PAGEREF _Toc236262503 \h </w:instrText>
+          <w:instrText xml:space="preserve"> PAGEREF _Toc236263699 \h </w:instrText>
         </w:r>
         <w:r>
           <w:rPr>
@@ -8164,7 +8173,7 @@
           <w:sz w:val="22"/>
         </w:rPr>
       </w:pPr>
-      <w:hyperlink w:anchor="_Toc236262504" w:history="1">
+      <w:hyperlink w:anchor="_Toc236263700" w:history="1">
         <w:r>
           <w:rPr>
             <w:rStyle w:val="Hyperlink"/>
@@ -8193,7 +8202,7 @@
             <w:noProof/>
             <w:webHidden/>
           </w:rPr>
-          <w:instrText xml:space="preserve"> PAGEREF _Toc236262504 \h </w:instrText>
+          <w:instrText xml:space="preserve"> PAGEREF _Toc236263700 \h </w:instrText>
         </w:r>
         <w:r>
           <w:rPr>
@@ -8236,7 +8245,7 @@
           <w:sz w:val="22"/>
         </w:rPr>
       </w:pPr>
-      <w:hyperlink w:anchor="_Toc236262505" w:history="1">
+      <w:hyperlink w:anchor="_Toc236263701" w:history="1">
         <w:r>
           <w:rPr>
             <w:rStyle w:val="Hyperlink"/>
@@ -8265,7 +8274,7 @@
             <w:noProof/>
             <w:webHidden/>
           </w:rPr>
-          <w:instrText xml:space="preserve"> PAGEREF _Toc236262505 \h </w:instrText>
+          <w:instrText xml:space="preserve"> PAGEREF _Toc236263701 \h </w:instrText>
         </w:r>
         <w:r>
           <w:rPr>
@@ -8308,7 +8317,7 @@
           <w:sz w:val="22"/>
         </w:rPr>
       </w:pPr>
-      <w:hyperlink w:anchor="_Toc236262506" w:history="1">
+      <w:hyperlink w:anchor="_Toc236263702" w:history="1">
         <w:r>
           <w:rPr>
             <w:rStyle w:val="Hyperlink"/>
@@ -8337,7 +8346,7 @@
             <w:noProof/>
             <w:webHidden/>
           </w:rPr>
-          <w:instrText xml:space="preserve"> PAGEREF _Toc236262506 \h </w:instrText>
+          <w:instrText xml:space="preserve"> PAGEREF _Toc236263702 \h </w:instrText>
         </w:r>
         <w:r>
           <w:rPr>
@@ -8380,7 +8389,7 @@
           <w:sz w:val="22"/>
         </w:rPr>
       </w:pPr>
-      <w:hyperlink w:anchor="_Toc236262507" w:history="1">
+      <w:hyperlink w:anchor="_Toc236263703" w:history="1">
         <w:r>
           <w:rPr>
             <w:rStyle w:val="Hyperlink"/>
@@ -8409,7 +8418,7 @@
             <w:noProof/>
             <w:webHidden/>
           </w:rPr>
-          <w:instrText xml:space="preserve"> PAGEREF _Toc236262507 \h </w:instrText>
+          <w:instrText xml:space="preserve"> PAGEREF _Toc236263703 \h </w:instrText>
         </w:r>
         <w:r>
           <w:rPr>
@@ -8452,7 +8461,7 @@
           <w:sz w:val="22"/>
         </w:rPr>
       </w:pPr>
-      <w:hyperlink w:anchor="_Toc236262508" w:history="1">
+      <w:hyperlink w:anchor="_Toc236263704" w:history="1">
         <w:r>
           <w:rPr>
             <w:rStyle w:val="Hyperlink"/>
@@ -8481,7 +8490,7 @@
             <w:noProof/>
             <w:webHidden/>
           </w:rPr>
-          <w:instrText xml:space="preserve"> PAGEREF _Toc236262508 \h </w:instrText>
+          <w:instrText xml:space="preserve"> PAGEREF _Toc236263704 \h </w:instrText>
         </w:r>
         <w:r>
           <w:rPr>
@@ -8524,7 +8533,7 @@
           <w:sz w:val="22"/>
         </w:rPr>
       </w:pPr>
-      <w:hyperlink w:anchor="_Toc236262509" w:history="1">
+      <w:hyperlink w:anchor="_Toc236263705" w:history="1">
         <w:r>
           <w:rPr>
             <w:rStyle w:val="Hyperlink"/>
@@ -8553,7 +8562,7 @@
             <w:noProof/>
             <w:webHidden/>
           </w:rPr>
-          <w:instrText xml:space="preserve"> PAGEREF _Toc236262509 \h </w:instrText>
+          <w:instrText xml:space="preserve"> PAGEREF _Toc236263705 \h </w:instrText>
         </w:r>
         <w:r>
           <w:rPr>
@@ -8596,7 +8605,7 @@
           <w:sz w:val="22"/>
         </w:rPr>
       </w:pPr>
-      <w:hyperlink w:anchor="_Toc236262510" w:history="1">
+      <w:hyperlink w:anchor="_Toc236263706" w:history="1">
         <w:r>
           <w:rPr>
             <w:rStyle w:val="Hyperlink"/>
@@ -8625,7 +8634,7 @@
             <w:noProof/>
             <w:webHidden/>
           </w:rPr>
-          <w:instrText xml:space="preserve"> PAGEREF _Toc236262510 \h </w:instrText>
+          <w:instrText xml:space="preserve"> PAGEREF _Toc236263706 \h </w:instrText>
         </w:r>
         <w:r>
           <w:rPr>
@@ -8668,7 +8677,7 @@
           <w:sz w:val="22"/>
         </w:rPr>
       </w:pPr>
-      <w:hyperlink w:anchor="_Toc236262511" w:history="1">
+      <w:hyperlink w:anchor="_Toc236263707" w:history="1">
         <w:r>
           <w:rPr>
             <w:rStyle w:val="Hyperlink"/>
@@ -8697,7 +8706,7 @@
             <w:noProof/>
             <w:webHidden/>
           </w:rPr>
-          <w:instrText xml:space="preserve"> PAGEREF _Toc236262511 \h </w:instrText>
+          <w:instrText xml:space="preserve"> PAGEREF _Toc236263707 \h </w:instrText>
         </w:r>
         <w:r>
           <w:rPr>
@@ -8740,7 +8749,7 @@
           <w:sz w:val="22"/>
         </w:rPr>
       </w:pPr>
-      <w:hyperlink w:anchor="_Toc236262512" w:history="1">
+      <w:hyperlink w:anchor="_Toc236263708" w:history="1">
         <w:r>
           <w:rPr>
             <w:rStyle w:val="Hyperlink"/>
@@ -8769,7 +8778,7 @@
             <w:noProof/>
             <w:webHidden/>
           </w:rPr>
-          <w:instrText xml:space="preserve"> PAGEREF _Toc236262512 \h </w:instrText>
+          <w:instrText xml:space="preserve"> PAGEREF _Toc236263708 \h </w:instrText>
         </w:r>
         <w:r>
           <w:rPr>
@@ -8812,7 +8821,7 @@
           <w:sz w:val="22"/>
         </w:rPr>
       </w:pPr>
-      <w:hyperlink w:anchor="_Toc236262513" w:history="1">
+      <w:hyperlink w:anchor="_Toc236263709" w:history="1">
         <w:r>
           <w:rPr>
             <w:rStyle w:val="Hyperlink"/>
@@ -8841,7 +8850,7 @@
             <w:noProof/>
             <w:webHidden/>
           </w:rPr>
-          <w:instrText xml:space="preserve"> PAGEREF _Toc236262513 \h </w:instrText>
+          <w:instrText xml:space="preserve"> PAGEREF _Toc236263709 \h </w:instrText>
         </w:r>
         <w:r>
           <w:rPr>
@@ -8884,7 +8893,7 @@
           <w:sz w:val="22"/>
         </w:rPr>
       </w:pPr>
-      <w:hyperlink w:anchor="_Toc236262514" w:history="1">
+      <w:hyperlink w:anchor="_Toc236263710" w:history="1">
         <w:r>
           <w:rPr>
             <w:rStyle w:val="Hyperlink"/>
@@ -8913,7 +8922,7 @@
             <w:noProof/>
             <w:webHidden/>
           </w:rPr>
-          <w:instrText xml:space="preserve"> PAGEREF _Toc236262514 \h </w:instrText>
+          <w:instrText xml:space="preserve"> PAGEREF _Toc236263710 \h </w:instrText>
         </w:r>
         <w:r>
           <w:rPr>
@@ -8956,7 +8965,7 @@
           <w:sz w:val="22"/>
         </w:rPr>
       </w:pPr>
-      <w:hyperlink w:anchor="_Toc236262515" w:history="1">
+      <w:hyperlink w:anchor="_Toc236263711" w:history="1">
         <w:r>
           <w:rPr>
             <w:rStyle w:val="Hyperlink"/>
@@ -8985,7 +8994,7 @@
             <w:noProof/>
             <w:webHidden/>
           </w:rPr>
-          <w:instrText xml:space="preserve"> PAGEREF _Toc236262515 \h </w:instrText>
+          <w:instrText xml:space="preserve"> PAGEREF _Toc236263711 \h </w:instrText>
         </w:r>
         <w:r>
           <w:rPr>
@@ -9028,7 +9037,7 @@
           <w:sz w:val="22"/>
         </w:rPr>
       </w:pPr>
-      <w:hyperlink w:anchor="_Toc236262516" w:history="1">
+      <w:hyperlink w:anchor="_Toc236263712" w:history="1">
         <w:r>
           <w:rPr>
             <w:rStyle w:val="Hyperlink"/>
@@ -9057,7 +9066,7 @@
             <w:noProof/>
             <w:webHidden/>
           </w:rPr>
-          <w:instrText xml:space="preserve"> PAGEREF _Toc236262516 \h </w:instrText>
+          <w:instrText xml:space="preserve"> PAGEREF _Toc236263712 \h </w:instrText>
         </w:r>
         <w:r>
           <w:rPr>
@@ -9100,7 +9109,7 @@
           <w:sz w:val="22"/>
         </w:rPr>
       </w:pPr>
-      <w:hyperlink w:anchor="_Toc236262517" w:history="1">
+      <w:hyperlink w:anchor="_Toc236263713" w:history="1">
         <w:r>
           <w:rPr>
             <w:rStyle w:val="Hyperlink"/>
@@ -9129,7 +9138,7 @@
             <w:noProof/>
             <w:webHidden/>
           </w:rPr>
-          <w:instrText xml:space="preserve"> PAGEREF _Toc236262517 \h </w:instrText>
+          <w:instrText xml:space="preserve"> PAGEREF _Toc236263713 \h </w:instrText>
         </w:r>
         <w:r>
           <w:rPr>
@@ -9172,7 +9181,7 @@
           <w:sz w:val="22"/>
         </w:rPr>
       </w:pPr>
-      <w:hyperlink w:anchor="_Toc236262518" w:history="1">
+      <w:hyperlink w:anchor="_Toc236263714" w:history="1">
         <w:r>
           <w:rPr>
             <w:rStyle w:val="Hyperlink"/>
@@ -9201,7 +9210,7 @@
             <w:noProof/>
             <w:webHidden/>
           </w:rPr>
-          <w:instrText xml:space="preserve"> PAGEREF _Toc236262518 \h </w:instrText>
+          <w:instrText xml:space="preserve"> PAGEREF _Toc236263714 \h </w:instrText>
         </w:r>
         <w:r>
           <w:rPr>
@@ -9244,7 +9253,7 @@
           <w:sz w:val="22"/>
         </w:rPr>
       </w:pPr>
-      <w:hyperlink w:anchor="_Toc236262519" w:history="1">
+      <w:hyperlink w:anchor="_Toc236263715" w:history="1">
         <w:r>
           <w:rPr>
             <w:rStyle w:val="Hyperlink"/>
@@ -9273,7 +9282,7 @@
             <w:noProof/>
             <w:webHidden/>
           </w:rPr>
-          <w:instrText xml:space="preserve"> PAGEREF _Toc236262519 \h </w:instrText>
+          <w:instrText xml:space="preserve"> PAGEREF _Toc236263715 \h </w:instrText>
         </w:r>
         <w:r>
           <w:rPr>
@@ -9316,7 +9325,7 @@
           <w:sz w:val="22"/>
         </w:rPr>
       </w:pPr>
-      <w:hyperlink w:anchor="_Toc236262520" w:history="1">
+      <w:hyperlink w:anchor="_Toc236263716" w:history="1">
         <w:r>
           <w:rPr>
             <w:rStyle w:val="Hyperlink"/>
@@ -9345,7 +9354,7 @@
             <w:noProof/>
             <w:webHidden/>
           </w:rPr>
-          <w:instrText xml:space="preserve"> PAGEREF _Toc236262520 \h </w:instrText>
+          <w:instrText xml:space="preserve"> PAGEREF _Toc236263716 \h </w:instrText>
         </w:r>
         <w:r>
           <w:rPr>
@@ -9438,15 +9447,14 @@
         </w:rPr>
         <w:fldChar w:fldCharType="separate"/>
       </w:r>
-      <w:hyperlink w:anchor="_Toc236262521" w:history="1">
+      <w:hyperlink w:anchor="_Toc236263717" w:history="1">
         <w:r>
           <w:rPr>
             <w:rStyle w:val="Hyperlink"/>
             <w:rFonts w:eastAsiaTheme="majorEastAsia"/>
             <w:noProof/>
-            <w:lang w:val="vi-VN" w:eastAsia="vi-VN"/>
-          </w:rPr>
-          <w:t>Hình 2.1. Kiến trúc tổng thể hệ thống Agentic SOC</w:t>
+          </w:rPr>
+          <w:t>Hình 2.1. Kiến trúc tổng thể A11 Agentic SOC local-first</w:t>
         </w:r>
         <w:r>
           <w:rPr>
@@ -9467,7 +9475,7 @@
             <w:noProof/>
             <w:webHidden/>
           </w:rPr>
-          <w:instrText xml:space="preserve"> PAGEREF _Toc236262521 \h </w:instrText>
+          <w:instrText xml:space="preserve"> PAGEREF _Toc236263717 \h </w:instrText>
         </w:r>
         <w:r>
           <w:rPr>
@@ -9510,15 +9518,14 @@
           <w:sz w:val="22"/>
         </w:rPr>
       </w:pPr>
-      <w:hyperlink w:anchor="_Toc236262522" w:history="1">
+      <w:hyperlink w:anchor="_Toc236263718" w:history="1">
         <w:r>
           <w:rPr>
             <w:rStyle w:val="Hyperlink"/>
             <w:rFonts w:eastAsiaTheme="majorEastAsia"/>
             <w:noProof/>
-            <w:lang w:val="vi-VN" w:eastAsia="vi-VN"/>
-          </w:rPr>
-          <w:t>Hình 2.2. Mô hình mạng lab và các luồng telemetry</w:t>
+          </w:rPr>
+          <w:t>Hình 2.2. Mô hình mạng lab, IP và tuyến telemetry local-first</w:t>
         </w:r>
         <w:r>
           <w:rPr>
@@ -9539,7 +9546,7 @@
             <w:noProof/>
             <w:webHidden/>
           </w:rPr>
-          <w:instrText xml:space="preserve"> PAGEREF _Toc236262522 \h </w:instrText>
+          <w:instrText xml:space="preserve"> PAGEREF _Toc236263718 \h </w:instrText>
         </w:r>
         <w:r>
           <w:rPr>
@@ -9582,7 +9589,7 @@
           <w:sz w:val="22"/>
         </w:rPr>
       </w:pPr>
-      <w:hyperlink w:anchor="_Toc236262523" w:history="1">
+      <w:hyperlink w:anchor="_Toc236263719" w:history="1">
         <w:r>
           <w:rPr>
             <w:rStyle w:val="Hyperlink"/>
@@ -9610,7 +9617,7 @@
             <w:noProof/>
             <w:webHidden/>
           </w:rPr>
-          <w:instrText xml:space="preserve"> PAGEREF _Toc236262523 \h </w:instrText>
+          <w:instrText xml:space="preserve"> PAGEREF _Toc236263719 \h </w:instrText>
         </w:r>
         <w:r>
           <w:rPr>
@@ -9653,15 +9660,14 @@
           <w:sz w:val="22"/>
         </w:rPr>
       </w:pPr>
-      <w:hyperlink w:anchor="_Toc236262524" w:history="1">
+      <w:hyperlink w:anchor="_Toc236263720" w:history="1">
         <w:r>
           <w:rPr>
             <w:rStyle w:val="Hyperlink"/>
             <w:rFonts w:eastAsiaTheme="majorEastAsia"/>
             <w:noProof/>
-            <w:lang w:val="vi-VN" w:eastAsia="vi-VN"/>
-          </w:rPr>
-          <w:t>Hình 2.4. Mô hình phối hợp các agent</w:t>
+          </w:rPr>
+          <w:t>Hình 2.4. Mô hình phối hợp SOCPipeline, RAG và n8n</w:t>
         </w:r>
         <w:r>
           <w:rPr>
@@ -9682,7 +9688,7 @@
             <w:noProof/>
             <w:webHidden/>
           </w:rPr>
-          <w:instrText xml:space="preserve"> PAGEREF _Toc236262524 \h </w:instrText>
+          <w:instrText xml:space="preserve"> PAGEREF _Toc236263720 \h </w:instrText>
         </w:r>
         <w:r>
           <w:rPr>
@@ -9725,7 +9731,7 @@
           <w:sz w:val="22"/>
         </w:rPr>
       </w:pPr>
-      <w:hyperlink w:anchor="_Toc236262525" w:history="1">
+      <w:hyperlink w:anchor="_Toc236263721" w:history="1">
         <w:r>
           <w:rPr>
             <w:rStyle w:val="Hyperlink"/>
@@ -9754,7 +9760,7 @@
             <w:noProof/>
             <w:webHidden/>
           </w:rPr>
-          <w:instrText xml:space="preserve"> PAGEREF _Toc236262525 \h </w:instrText>
+          <w:instrText xml:space="preserve"> PAGEREF _Toc236263721 \h </w:instrText>
         </w:r>
         <w:r>
           <w:rPr>
@@ -9797,7 +9803,7 @@
           <w:sz w:val="22"/>
         </w:rPr>
       </w:pPr>
-      <w:hyperlink w:anchor="_Toc236262526" w:history="1">
+      <w:hyperlink w:anchor="_Toc236263722" w:history="1">
         <w:r>
           <w:rPr>
             <w:rStyle w:val="Hyperlink"/>
@@ -9826,7 +9832,7 @@
             <w:noProof/>
             <w:webHidden/>
           </w:rPr>
-          <w:instrText xml:space="preserve"> PAGEREF _Toc236262526 \h </w:instrText>
+          <w:instrText xml:space="preserve"> PAGEREF _Toc236263722 \h </w:instrText>
         </w:r>
         <w:r>
           <w:rPr>
@@ -9869,7 +9875,7 @@
           <w:sz w:val="22"/>
         </w:rPr>
       </w:pPr>
-      <w:hyperlink w:anchor="_Toc236262527" w:history="1">
+      <w:hyperlink w:anchor="_Toc236263723" w:history="1">
         <w:r>
           <w:rPr>
             <w:rStyle w:val="Hyperlink"/>
@@ -9898,7 +9904,7 @@
             <w:noProof/>
             <w:webHidden/>
           </w:rPr>
-          <w:instrText xml:space="preserve"> PAGEREF _Toc236262527 \h </w:instrText>
+          <w:instrText xml:space="preserve"> PAGEREF _Toc236263723 \h </w:instrText>
         </w:r>
         <w:r>
           <w:rPr>
@@ -9941,7 +9947,7 @@
           <w:sz w:val="22"/>
         </w:rPr>
       </w:pPr>
-      <w:hyperlink w:anchor="_Toc236262528" w:history="1">
+      <w:hyperlink w:anchor="_Toc236263724" w:history="1">
         <w:r>
           <w:rPr>
             <w:rStyle w:val="Hyperlink"/>
@@ -9970,7 +9976,7 @@
             <w:noProof/>
             <w:webHidden/>
           </w:rPr>
-          <w:instrText xml:space="preserve"> PAGEREF _Toc236262528 \h </w:instrText>
+          <w:instrText xml:space="preserve"> PAGEREF _Toc236263724 \h </w:instrText>
         </w:r>
         <w:r>
           <w:rPr>
@@ -10013,7 +10019,7 @@
           <w:sz w:val="22"/>
         </w:rPr>
       </w:pPr>
-      <w:hyperlink w:anchor="_Toc236262529" w:history="1">
+      <w:hyperlink w:anchor="_Toc236263725" w:history="1">
         <w:r>
           <w:rPr>
             <w:rStyle w:val="Hyperlink"/>
@@ -10042,7 +10048,7 @@
             <w:noProof/>
             <w:webHidden/>
           </w:rPr>
-          <w:instrText xml:space="preserve"> PAGEREF _Toc236262529 \h </w:instrText>
+          <w:instrText xml:space="preserve"> PAGEREF _Toc236263725 \h </w:instrText>
         </w:r>
         <w:r>
           <w:rPr>
@@ -10085,7 +10091,7 @@
           <w:sz w:val="22"/>
         </w:rPr>
       </w:pPr>
-      <w:hyperlink w:anchor="_Toc236262530" w:history="1">
+      <w:hyperlink w:anchor="_Toc236263726" w:history="1">
         <w:r>
           <w:rPr>
             <w:rStyle w:val="Hyperlink"/>
@@ -10114,7 +10120,7 @@
             <w:noProof/>
             <w:webHidden/>
           </w:rPr>
-          <w:instrText xml:space="preserve"> PAGEREF _Toc236262530 \h </w:instrText>
+          <w:instrText xml:space="preserve"> PAGEREF _Toc236263726 \h </w:instrText>
         </w:r>
         <w:r>
           <w:rPr>
@@ -10157,7 +10163,7 @@
           <w:sz w:val="22"/>
         </w:rPr>
       </w:pPr>
-      <w:hyperlink w:anchor="_Toc236262531" w:history="1">
+      <w:hyperlink w:anchor="_Toc236263727" w:history="1">
         <w:r>
           <w:rPr>
             <w:rStyle w:val="Hyperlink"/>
@@ -10186,7 +10192,7 @@
             <w:noProof/>
             <w:webHidden/>
           </w:rPr>
-          <w:instrText xml:space="preserve"> PAGEREF _Toc236262531 \h </w:instrText>
+          <w:instrText xml:space="preserve"> PAGEREF _Toc236263727 \h </w:instrText>
         </w:r>
         <w:r>
           <w:rPr>
@@ -10229,7 +10235,7 @@
           <w:sz w:val="22"/>
         </w:rPr>
       </w:pPr>
-      <w:hyperlink w:anchor="_Toc236262532" w:history="1">
+      <w:hyperlink w:anchor="_Toc236263728" w:history="1">
         <w:r>
           <w:rPr>
             <w:rStyle w:val="Hyperlink"/>
@@ -10258,7 +10264,7 @@
             <w:noProof/>
             <w:webHidden/>
           </w:rPr>
-          <w:instrText xml:space="preserve"> PAGEREF _Toc236262532 \h </w:instrText>
+          <w:instrText xml:space="preserve"> PAGEREF _Toc236263728 \h </w:instrText>
         </w:r>
         <w:r>
           <w:rPr>
@@ -10301,7 +10307,7 @@
           <w:sz w:val="22"/>
         </w:rPr>
       </w:pPr>
-      <w:hyperlink w:anchor="_Toc236262533" w:history="1">
+      <w:hyperlink w:anchor="_Toc236263729" w:history="1">
         <w:r>
           <w:rPr>
             <w:rStyle w:val="Hyperlink"/>
@@ -10330,7 +10336,7 @@
             <w:noProof/>
             <w:webHidden/>
           </w:rPr>
-          <w:instrText xml:space="preserve"> PAGEREF _Toc236262533 \h </w:instrText>
+          <w:instrText xml:space="preserve"> PAGEREF _Toc236263729 \h </w:instrText>
         </w:r>
         <w:r>
           <w:rPr>
@@ -10373,7 +10379,7 @@
           <w:sz w:val="22"/>
         </w:rPr>
       </w:pPr>
-      <w:hyperlink w:anchor="_Toc236262534" w:history="1">
+      <w:hyperlink w:anchor="_Toc236263730" w:history="1">
         <w:r>
           <w:rPr>
             <w:rStyle w:val="Hyperlink"/>
@@ -10402,7 +10408,7 @@
             <w:noProof/>
             <w:webHidden/>
           </w:rPr>
-          <w:instrText xml:space="preserve"> PAGEREF _Toc236262534 \h </w:instrText>
+          <w:instrText xml:space="preserve"> PAGEREF _Toc236263730 \h </w:instrText>
         </w:r>
         <w:r>
           <w:rPr>
@@ -10445,15 +10451,14 @@
           <w:sz w:val="22"/>
         </w:rPr>
       </w:pPr>
-      <w:hyperlink w:anchor="_Toc236262535" w:history="1">
+      <w:hyperlink w:anchor="_Toc236263731" w:history="1">
         <w:r>
           <w:rPr>
             <w:rStyle w:val="Hyperlink"/>
             <w:rFonts w:eastAsiaTheme="majorEastAsia"/>
             <w:noProof/>
-            <w:lang w:val="vi-VN" w:eastAsia="vi-VN"/>
-          </w:rPr>
-          <w:t>Hình 3.10. Kiến trúc triển khai bằng Docker Compose</w:t>
+          </w:rPr>
+          <w:t>Hình 3.10. Docker Compose trên Ubuntu Server với n8n workflow</w:t>
         </w:r>
         <w:r>
           <w:rPr>
@@ -10474,7 +10479,7 @@
             <w:noProof/>
             <w:webHidden/>
           </w:rPr>
-          <w:instrText xml:space="preserve"> PAGEREF _Toc236262535 \h </w:instrText>
+          <w:instrText xml:space="preserve"> PAGEREF _Toc236263731 \h </w:instrText>
         </w:r>
         <w:r>
           <w:rPr>
@@ -10517,15 +10522,14 @@
           <w:sz w:val="22"/>
         </w:rPr>
       </w:pPr>
-      <w:hyperlink w:anchor="_Toc236262536" w:history="1">
+      <w:hyperlink w:anchor="_Toc236263732" w:history="1">
         <w:r>
           <w:rPr>
             <w:rStyle w:val="Hyperlink"/>
             <w:rFonts w:eastAsiaTheme="majorEastAsia"/>
             <w:noProof/>
-            <w:lang w:val="vi-VN" w:eastAsia="vi-VN"/>
-          </w:rPr>
-          <w:t>Hình 3.11. Sequence từ tấn công đến phê duyệt phản ứng</w:t>
+          </w:rPr>
+          <w:t>Hình 3.11. Sequence từ tấn công đến RAG, approval, n8n và audit</w:t>
         </w:r>
         <w:r>
           <w:rPr>
@@ -10546,7 +10550,7 @@
             <w:noProof/>
             <w:webHidden/>
           </w:rPr>
-          <w:instrText xml:space="preserve"> PAGEREF _Toc236262536 \h </w:instrText>
+          <w:instrText xml:space="preserve"> PAGEREF _Toc236263732 \h </w:instrText>
         </w:r>
         <w:r>
           <w:rPr>
@@ -10589,15 +10593,14 @@
           <w:sz w:val="22"/>
         </w:rPr>
       </w:pPr>
-      <w:hyperlink w:anchor="_Toc236262537" w:history="1">
+      <w:hyperlink w:anchor="_Toc236263733" w:history="1">
         <w:r>
           <w:rPr>
             <w:rStyle w:val="Hyperlink"/>
             <w:rFonts w:eastAsiaTheme="majorEastAsia"/>
             <w:noProof/>
-            <w:lang w:val="vi-VN" w:eastAsia="vi-VN"/>
-          </w:rPr>
-          <w:t>Hình 3.12. Vòng đời alert, incident và response action</w:t>
+          </w:rPr>
+          <w:t>Hình 3.12. Vòng đời alert, incident, response action và audit</w:t>
         </w:r>
         <w:r>
           <w:rPr>
@@ -10618,7 +10621,7 @@
             <w:noProof/>
             <w:webHidden/>
           </w:rPr>
-          <w:instrText xml:space="preserve"> PAGEREF _Toc236262537 \h </w:instrText>
+          <w:instrText xml:space="preserve"> PAGEREF _Toc236263733 \h </w:instrText>
         </w:r>
         <w:r>
           <w:rPr>
@@ -10661,7 +10664,7 @@
           <w:sz w:val="22"/>
         </w:rPr>
       </w:pPr>
-      <w:hyperlink w:anchor="_Toc236262538" w:history="1">
+      <w:hyperlink w:anchor="_Toc236263734" w:history="1">
         <w:r>
           <w:rPr>
             <w:rStyle w:val="Hyperlink"/>
@@ -10690,7 +10693,7 @@
             <w:noProof/>
             <w:webHidden/>
           </w:rPr>
-          <w:instrText xml:space="preserve"> PAGEREF _Toc236262538 \h </w:instrText>
+          <w:instrText xml:space="preserve"> PAGEREF _Toc236263734 \h </w:instrText>
         </w:r>
         <w:r>
           <w:rPr>
@@ -10733,7 +10736,7 @@
           <w:sz w:val="22"/>
         </w:rPr>
       </w:pPr>
-      <w:hyperlink w:anchor="_Toc236262539" w:history="1">
+      <w:hyperlink w:anchor="_Toc236263735" w:history="1">
         <w:r>
           <w:rPr>
             <w:rStyle w:val="Hyperlink"/>
@@ -10762,7 +10765,7 @@
             <w:noProof/>
             <w:webHidden/>
           </w:rPr>
-          <w:instrText xml:space="preserve"> PAGEREF _Toc236262539 \h </w:instrText>
+          <w:instrText xml:space="preserve"> PAGEREF _Toc236263735 \h </w:instrText>
         </w:r>
         <w:r>
           <w:rPr>
@@ -10805,15 +10808,14 @@
           <w:sz w:val="22"/>
         </w:rPr>
       </w:pPr>
-      <w:hyperlink w:anchor="_Toc236262540" w:history="1">
+      <w:hyperlink w:anchor="_Toc236263736" w:history="1">
         <w:r>
           <w:rPr>
             <w:rStyle w:val="Hyperlink"/>
             <w:rFonts w:eastAsiaTheme="majorEastAsia"/>
             <w:noProof/>
-            <w:lang w:val="vi-VN" w:eastAsia="vi-VN"/>
-          </w:rPr>
-          <w:t>Hình 3.15. Splunk Cloud hiển thị kết quả Apache access log</w:t>
+          </w:rPr>
+          <w:t>Hình 3.15. Splunk/SIEM quan sát bản sao Apache access log</w:t>
         </w:r>
         <w:r>
           <w:rPr>
@@ -10834,7 +10836,7 @@
             <w:noProof/>
             <w:webHidden/>
           </w:rPr>
-          <w:instrText xml:space="preserve"> PAGEREF _Toc236262540 \h </w:instrText>
+          <w:instrText xml:space="preserve"> PAGEREF _Toc236263736 \h </w:instrText>
         </w:r>
         <w:r>
           <w:rPr>
@@ -10877,7 +10879,7 @@
           <w:sz w:val="22"/>
         </w:rPr>
       </w:pPr>
-      <w:hyperlink w:anchor="_Toc236262541" w:history="1">
+      <w:hyperlink w:anchor="_Toc236263737" w:history="1">
         <w:r>
           <w:rPr>
             <w:rStyle w:val="Hyperlink"/>
@@ -10906,7 +10908,7 @@
             <w:noProof/>
             <w:webHidden/>
           </w:rPr>
-          <w:instrText xml:space="preserve"> PAGEREF _Toc236262541 \h </w:instrText>
+          <w:instrText xml:space="preserve"> PAGEREF _Toc236263737 \h </w:instrText>
         </w:r>
         <w:r>
           <w:rPr>
@@ -10970,7 +10972,7 @@
       <w:pPr>
         <w:pStyle w:val="TableCaption"/>
       </w:pPr>
-      <w:bookmarkStart w:id="3" w:name="_Toc236262502"/>
+      <w:bookmarkStart w:id="3" w:name="_Toc236263698"/>
       <w:r>
         <w:rPr>
           <w:lang w:val="vi-VN" w:eastAsia="vi-VN"/>
@@ -12109,7 +12111,7 @@
       <w:pPr>
         <w:pStyle w:val="Heading1"/>
       </w:pPr>
-      <w:bookmarkStart w:id="4" w:name="_Toc236262432"/>
+      <w:bookmarkStart w:id="4" w:name="_Toc236263628"/>
       <w:r>
         <w:rPr>
           <w:rFonts w:ascii="Times New Roman" w:eastAsia="Times New Roman" w:hAnsi="Times New Roman"/>
@@ -12124,7 +12126,7 @@
       <w:pPr>
         <w:pStyle w:val="Heading2"/>
       </w:pPr>
-      <w:bookmarkStart w:id="5" w:name="_Toc236262433"/>
+      <w:bookmarkStart w:id="5" w:name="_Toc236263629"/>
       <w:r>
         <w:rPr>
           <w:rFonts w:ascii="Times New Roman" w:eastAsia="Times New Roman" w:hAnsi="Times New Roman"/>
@@ -12160,7 +12162,7 @@
       <w:pPr>
         <w:pStyle w:val="Heading2"/>
       </w:pPr>
-      <w:bookmarkStart w:id="6" w:name="_Toc236262434"/>
+      <w:bookmarkStart w:id="6" w:name="_Toc236263630"/>
       <w:r>
         <w:rPr>
           <w:rFonts w:ascii="Times New Roman" w:eastAsia="Times New Roman" w:hAnsi="Times New Roman"/>
@@ -12231,7 +12233,7 @@
       <w:pPr>
         <w:pStyle w:val="Heading2"/>
       </w:pPr>
-      <w:bookmarkStart w:id="7" w:name="_Toc236262435"/>
+      <w:bookmarkStart w:id="7" w:name="_Toc236263631"/>
       <w:r>
         <w:rPr>
           <w:rFonts w:ascii="Times New Roman" w:eastAsia="Times New Roman" w:hAnsi="Times New Roman"/>
@@ -12257,7 +12259,7 @@
       <w:pPr>
         <w:pStyle w:val="Heading2"/>
       </w:pPr>
-      <w:bookmarkStart w:id="8" w:name="_Toc236262436"/>
+      <w:bookmarkStart w:id="8" w:name="_Toc236263632"/>
       <w:r>
         <w:rPr>
           <w:rFonts w:ascii="Times New Roman" w:eastAsia="Times New Roman" w:hAnsi="Times New Roman"/>
@@ -12282,7 +12284,7 @@
       <w:pPr>
         <w:pStyle w:val="Heading2"/>
       </w:pPr>
-      <w:bookmarkStart w:id="9" w:name="_Toc236262437"/>
+      <w:bookmarkStart w:id="9" w:name="_Toc236263633"/>
       <w:r>
         <w:rPr>
           <w:rFonts w:ascii="Times New Roman" w:eastAsia="Times New Roman" w:hAnsi="Times New Roman"/>
@@ -12320,7 +12322,7 @@
       <w:pPr>
         <w:pStyle w:val="Heading1"/>
       </w:pPr>
-      <w:bookmarkStart w:id="10" w:name="_Toc236262438"/>
+      <w:bookmarkStart w:id="10" w:name="_Toc236263634"/>
       <w:r>
         <w:rPr>
           <w:rFonts w:ascii="Times New Roman" w:eastAsia="Times New Roman" w:hAnsi="Times New Roman"/>
@@ -12335,7 +12337,7 @@
       <w:pPr>
         <w:pStyle w:val="Heading2"/>
       </w:pPr>
-      <w:bookmarkStart w:id="11" w:name="_Toc236262439"/>
+      <w:bookmarkStart w:id="11" w:name="_Toc236263635"/>
       <w:r>
         <w:rPr>
           <w:rFonts w:ascii="Times New Roman" w:eastAsia="Times New Roman" w:hAnsi="Times New Roman"/>
@@ -12371,7 +12373,7 @@
       <w:pPr>
         <w:pStyle w:val="Heading2"/>
       </w:pPr>
-      <w:bookmarkStart w:id="12" w:name="_Toc236262440"/>
+      <w:bookmarkStart w:id="12" w:name="_Toc236263636"/>
       <w:r>
         <w:rPr>
           <w:rFonts w:ascii="Times New Roman" w:eastAsia="Times New Roman" w:hAnsi="Times New Roman"/>
@@ -12396,7 +12398,7 @@
       <w:pPr>
         <w:pStyle w:val="TableCaption"/>
       </w:pPr>
-      <w:bookmarkStart w:id="13" w:name="_Toc236262503"/>
+      <w:bookmarkStart w:id="13" w:name="_Toc236263699"/>
       <w:r>
         <w:rPr>
           <w:lang w:val="vi-VN" w:eastAsia="vi-VN"/>
@@ -13027,7 +13029,7 @@
       <w:pPr>
         <w:pStyle w:val="Heading2"/>
       </w:pPr>
-      <w:bookmarkStart w:id="14" w:name="_Toc236262441"/>
+      <w:bookmarkStart w:id="14" w:name="_Toc236263637"/>
       <w:r>
         <w:rPr>
           <w:rFonts w:ascii="Times New Roman" w:eastAsia="Times New Roman" w:hAnsi="Times New Roman"/>
@@ -13070,7 +13072,7 @@
       <w:pPr>
         <w:pStyle w:val="Heading2"/>
       </w:pPr>
-      <w:bookmarkStart w:id="15" w:name="_Toc236262442"/>
+      <w:bookmarkStart w:id="15" w:name="_Toc236263638"/>
       <w:r>
         <w:rPr>
           <w:rFonts w:ascii="Times New Roman" w:eastAsia="Times New Roman" w:hAnsi="Times New Roman"/>
@@ -13093,20 +13095,20 @@
     </w:p>
     <w:p>
       <w:pPr>
-        <w:ind w:firstLine="567"/>
+        <w:ind w:firstLine="432"/>
       </w:pPr>
       <w:r>
         <w:rPr>
-          <w:lang w:val="vi-VN" w:eastAsia="vi-VN"/>
+          <w:sz w:val="22"/>
         </w:rPr>
-        <w:t>RAG kết hợp truy xuất tài liệu với sinh nội dung. Knowledge Base của đề tài nạp bốn tài liệu Markdown: chính sách vận hành, ứng phó brute force, web attack và Windows endpoint. Truy xuất dùng vector từ tần suất token cục bộ, phù hợp với lab nhỏ và không gửi log ra Internet. Kết quả truy xuất được đưa vào nhận định hoặc report dưới dạng khuyến nghị; policy thực thi không lấy trực tiếp từ câu trả lời LLM.</w:t>
+        <w:t>RAG kết hợp truy xuất tài liệu với sinh nội dung. Knowledge Base của đề tài hiện nạp tám playbook Markdown trong thư mục knowledge/: chính sách vận hành SOC, phản ứng web attack, brute force, Windows endpoint, Suricata network scan, OPNsense containment, n8n automation workflow và vận hành Ubuntu local. Truy xuất dùng chỉ mục cục bộ theo token/tag, không gửi dữ liệu ra cloud; kết quả RAG cung cấp ngữ cảnh cho Triage/LLM và Report Agent.</w:t>
       </w:r>
     </w:p>
     <w:p>
       <w:pPr>
         <w:pStyle w:val="Heading2"/>
       </w:pPr>
-      <w:bookmarkStart w:id="16" w:name="_Toc236262443"/>
+      <w:bookmarkStart w:id="16" w:name="_Toc236263639"/>
       <w:r>
         <w:rPr>
           <w:rFonts w:ascii="Times New Roman" w:eastAsia="Times New Roman" w:hAnsi="Times New Roman"/>
@@ -13142,7 +13144,7 @@
       <w:pPr>
         <w:pStyle w:val="TableCaption"/>
       </w:pPr>
-      <w:bookmarkStart w:id="17" w:name="_Toc236262504"/>
+      <w:bookmarkStart w:id="17" w:name="_Toc236263700"/>
       <w:r>
         <w:rPr>
           <w:lang w:val="vi-VN" w:eastAsia="vi-VN"/>
@@ -13618,7 +13620,6 @@
                 <w:sz w:val="19"/>
                 <w:lang w:val="vi-VN" w:eastAsia="vi-VN"/>
               </w:rPr>
-              <w:lastRenderedPageBreak/>
               <w:t>Quan sát</w:t>
             </w:r>
           </w:p>
@@ -13701,6 +13702,7 @@
                 <w:sz w:val="19"/>
                 <w:lang w:val="vi-VN" w:eastAsia="vi-VN"/>
               </w:rPr>
+              <w:lastRenderedPageBreak/>
               <w:t>Triển khai</w:t>
             </w:r>
           </w:p>
@@ -13774,7 +13776,7 @@
       <w:pPr>
         <w:pStyle w:val="Heading2"/>
       </w:pPr>
-      <w:bookmarkStart w:id="18" w:name="_Toc236262444"/>
+      <w:bookmarkStart w:id="18" w:name="_Toc236263640"/>
       <w:r>
         <w:rPr>
           <w:rFonts w:ascii="Times New Roman" w:eastAsia="Times New Roman" w:hAnsi="Times New Roman"/>
@@ -13810,7 +13812,7 @@
       <w:pPr>
         <w:pStyle w:val="Heading2"/>
       </w:pPr>
-      <w:bookmarkStart w:id="19" w:name="_Toc236262445"/>
+      <w:bookmarkStart w:id="19" w:name="_Toc236263641"/>
       <w:r>
         <w:rPr>
           <w:rFonts w:ascii="Times New Roman" w:eastAsia="Times New Roman" w:hAnsi="Times New Roman"/>
@@ -13835,7 +13837,7 @@
       <w:pPr>
         <w:pStyle w:val="Heading2"/>
       </w:pPr>
-      <w:bookmarkStart w:id="20" w:name="_Toc236262446"/>
+      <w:bookmarkStart w:id="20" w:name="_Toc236263642"/>
       <w:r>
         <w:rPr>
           <w:rFonts w:ascii="Times New Roman" w:eastAsia="Times New Roman" w:hAnsi="Times New Roman"/>
@@ -13872,7 +13874,7 @@
       <w:pPr>
         <w:pStyle w:val="Heading1"/>
       </w:pPr>
-      <w:bookmarkStart w:id="21" w:name="_Toc236262447"/>
+      <w:bookmarkStart w:id="21" w:name="_Toc236263643"/>
       <w:r>
         <w:rPr>
           <w:rFonts w:ascii="Times New Roman" w:eastAsia="Times New Roman" w:hAnsi="Times New Roman"/>
@@ -13887,7 +13889,7 @@
       <w:pPr>
         <w:pStyle w:val="Heading2"/>
       </w:pPr>
-      <w:bookmarkStart w:id="22" w:name="_Toc236262448"/>
+      <w:bookmarkStart w:id="22" w:name="_Toc236263644"/>
       <w:r>
         <w:rPr>
           <w:rFonts w:ascii="Times New Roman" w:eastAsia="Times New Roman" w:hAnsi="Times New Roman"/>
@@ -13909,7 +13911,7 @@
       <w:pPr>
         <w:pStyle w:val="Heading2"/>
       </w:pPr>
-      <w:bookmarkStart w:id="23" w:name="_Toc236262449"/>
+      <w:bookmarkStart w:id="23" w:name="_Toc236263645"/>
       <w:r>
         <w:rPr>
           <w:rFonts w:ascii="Times New Roman" w:eastAsia="Times New Roman" w:hAnsi="Times New Roman"/>
@@ -13923,7 +13925,7 @@
       <w:pPr>
         <w:pStyle w:val="TableCaption"/>
       </w:pPr>
-      <w:bookmarkStart w:id="24" w:name="_Toc236262505"/>
+      <w:bookmarkStart w:id="24" w:name="_Toc236263701"/>
       <w:r>
         <w:rPr>
           <w:lang w:val="vi-VN" w:eastAsia="vi-VN"/>
@@ -14884,7 +14886,7 @@
       <w:pPr>
         <w:pStyle w:val="Heading2"/>
       </w:pPr>
-      <w:bookmarkStart w:id="25" w:name="_Toc236262450"/>
+      <w:bookmarkStart w:id="25" w:name="_Toc236263646"/>
       <w:r>
         <w:rPr>
           <w:rFonts w:ascii="Times New Roman" w:eastAsia="Times New Roman" w:hAnsi="Times New Roman"/>
@@ -14975,7 +14977,7 @@
       <w:pPr>
         <w:pStyle w:val="Heading2"/>
       </w:pPr>
-      <w:bookmarkStart w:id="26" w:name="_Toc236262451"/>
+      <w:bookmarkStart w:id="26" w:name="_Toc236263647"/>
       <w:r>
         <w:rPr>
           <w:rFonts w:ascii="Times New Roman" w:eastAsia="Times New Roman" w:hAnsi="Times New Roman"/>
@@ -14996,9 +14998,9 @@
         </w:rPr>
         <w:drawing>
           <wp:inline distT="0" distB="0" distL="0" distR="0">
-            <wp:extent cx="5532120" cy="3227070"/>
+            <wp:extent cx="5532120" cy="3626612"/>
             <wp:effectExtent l="0" t="0" r="0" b="0"/>
-            <wp:docPr id="3" name="Picture 3" descr="Bốn lớp kiến trúc gồm nguồn log, ingest và chuẩn hóa, agent AI, vận hành và phản ứng" title="Kiến trúc tổng thể hệ thống Agentic SOC"/>
+            <wp:docPr id="25" name="Picture 25" descr="Kiến trúc tổng thể A11 SOC local-first: telemetry, collector, SOCPipeline, Agentic AI/RAG, operations, data và Splunk quan sát." title="Kiến trúc tổng thể A11 SOC local-first: telemetry, collector, SOCPipeline, Agentic AI/RAG, operations, data và Splunk quan sát."/>
             <wp:cNvGraphicFramePr>
               <a:graphicFrameLocks xmlns:a="http://schemas.openxmlformats.org/drawingml/2006/main" noChangeAspect="1"/>
             </wp:cNvGraphicFramePr>
@@ -15018,7 +15020,7 @@
                   <pic:spPr>
                     <a:xfrm>
                       <a:off x="0" y="0"/>
-                      <a:ext cx="5532120" cy="3227070"/>
+                      <a:ext cx="5532120" cy="3626612"/>
                     </a:xfrm>
                     <a:prstGeom prst="rect">
                       <a:avLst/>
@@ -15035,12 +15037,12 @@
       <w:pPr>
         <w:pStyle w:val="FigureCaption"/>
       </w:pPr>
-      <w:bookmarkStart w:id="27" w:name="_Toc236262521"/>
+      <w:bookmarkStart w:id="27" w:name="_Toc236263717"/>
       <w:r>
         <w:rPr>
-          <w:lang w:val="vi-VN" w:eastAsia="vi-VN"/>
+          <w:sz w:val="20"/>
         </w:rPr>
-        <w:t>Hình 2.1. Kiến trúc tổng thể hệ thống Agentic SOC</w:t>
+        <w:t>Hình 2.1. Kiến trúc tổng thể A11 Agentic SOC local-first</w:t>
       </w:r>
       <w:bookmarkEnd w:id="27"/>
     </w:p>
@@ -15057,17 +15059,20 @@
     </w:p>
     <w:p>
       <w:pPr>
-        <w:ind w:firstLine="567"/>
+        <w:ind w:firstLine="432"/>
       </w:pPr>
       <w:r>
-        <w:t>Kiến trúc gồm bốn lớp. Lớp telemetry nhận trực tiếp dữ liệu từ OPNsense/Suricata, Apache và Windows; Splunk nằm ngoài critical path và chỉ quan sát bản sao log. Lớp ingest trên Ubuntu chuẩn hóa định dạng, tạo fingerprint và lưu bằng chứng. Lớp agent thực hiện triage, enrichment, RAG/LLM, tạo report và action proposal. Lớp vận hành cung cấp dashboard, incident queue, approval gate, response adapter và audit trail. Mỗi lớp có giao diện rõ ràng để có thể thay nguồn log hoặc mô hình AI mà không thay toàn bộ hệ thống.</w:t>
+        <w:rPr>
+          <w:sz w:val="22"/>
+        </w:rPr>
+        <w:t>Hình 2.1 trình bày kiến trúc local-first của A11 SOC theo đề tài mới. Telemetry từ OPNsense/Suricata, Apache và Windows được đưa trực tiếp vào A11 Collector trên Ubuntu Server; SOCPipeline thực hiện parse, normalize, dedup, correlate và persist; Agentic AI/RAG sinh nhận định, khuyến nghị, incident và báo cáo. Splunk/SIEM không nằm trên tuyến xử lý chính mà chỉ nhận bản sao log để quan sát, tìm kiếm raw log và đối chiếu khi demo.</w:t>
       </w:r>
     </w:p>
     <w:p>
       <w:pPr>
         <w:pStyle w:val="Heading2"/>
       </w:pPr>
-      <w:bookmarkStart w:id="28" w:name="_Toc236262452"/>
+      <w:bookmarkStart w:id="28" w:name="_Toc236263648"/>
       <w:r>
         <w:rPr>
           <w:rFonts w:ascii="Times New Roman" w:eastAsia="Times New Roman" w:hAnsi="Times New Roman"/>
@@ -15089,9 +15094,9 @@
         </w:rPr>
         <w:drawing>
           <wp:inline distT="0" distB="0" distL="0" distR="0">
-            <wp:extent cx="5532120" cy="3227070"/>
+            <wp:extent cx="5532120" cy="3626612"/>
             <wp:effectExtent l="0" t="0" r="0" b="0"/>
-            <wp:docPr id="4" name="Picture 4" descr="Kali ở WAN, OPNsense làm firewall, Ubuntu ở LAN/DMZ chạy Apache và Agentic SOC, kết nối Splunk Cloud" title="Mô hình mạng lab và các luồng telemetry"/>
+            <wp:docPr id="26" name="Picture 26" descr="Mô hình mạng lab nêu rõ IP Kali, OPNsense WAN/LAN, máy Web/Windows, A11 SOC Ubuntu và các giao thức REST/HEC/syslog." title="Mô hình mạng lab nêu rõ IP Kali, OPNsense WAN/LAN, máy Web/Windows, A11 SOC Ubuntu và các giao thức REST/HEC/syslog."/>
             <wp:cNvGraphicFramePr>
               <a:graphicFrameLocks xmlns:a="http://schemas.openxmlformats.org/drawingml/2006/main" noChangeAspect="1"/>
             </wp:cNvGraphicFramePr>
@@ -15111,7 +15116,7 @@
                   <pic:spPr>
                     <a:xfrm>
                       <a:off x="0" y="0"/>
-                      <a:ext cx="5532120" cy="3227070"/>
+                      <a:ext cx="5532120" cy="3626612"/>
                     </a:xfrm>
                     <a:prstGeom prst="rect">
                       <a:avLst/>
@@ -15128,12 +15133,12 @@
       <w:pPr>
         <w:pStyle w:val="FigureCaption"/>
       </w:pPr>
-      <w:bookmarkStart w:id="29" w:name="_Toc236262522"/>
+      <w:bookmarkStart w:id="29" w:name="_Toc236263718"/>
       <w:r>
         <w:rPr>
-          <w:lang w:val="vi-VN" w:eastAsia="vi-VN"/>
+          <w:sz w:val="20"/>
         </w:rPr>
-        <w:t>Hình 2.2. Mô hình mạng lab và các luồng telemetry</w:t>
+        <w:t>Hình 2.2. Mô hình mạng lab, IP và tuyến telemetry local-first</w:t>
       </w:r>
       <w:bookmarkEnd w:id="29"/>
     </w:p>
@@ -15150,17 +15155,20 @@
     </w:p>
     <w:p>
       <w:pPr>
-        <w:ind w:firstLine="567"/>
+        <w:ind w:firstLine="432"/>
       </w:pPr>
       <w:r>
-        <w:t>Kali Linux đóng vai trò nguồn kiểm thử bên WAN. OPNsense có các interface WAN, LAN và DMZ, thực hiện NAT và firewall. Máy chủ 192.168.1.100 chạy Apache/Suricata làm mục tiêu; máy Windows 192.168.1.101 cung cấp Security Event; Ubuntu Server 192.168.1.10 chạy A11 SOC độc lập. Log shipper gửi access.log và EVE JSON trực tiếp qua REST/HEC TCP/8000, Windows collector dùng cùng kênh, còn OPNsense gửi syslog UDP/5514. Splunk chỉ nhận bản sao telemetry để quan sát và không nằm trên tuyến xử lý bắt buộc.</w:t>
+        <w:rPr>
+          <w:sz w:val="22"/>
+        </w:rPr>
+        <w:t>Hình 2.2 mô tả rõ mạng lab và địa chỉ IP: Kali 192.168.228.128/24 ở WAN lab tấn công qua OPNsense WAN 192.168.228.142/24; OPNsense chuyển tiếp vào LAN 192.168.1.0/24, nơi có Web/Suricata 192.168.1.100/24, Windows endpoint 192.168.1.101/24 và A11 SOC Ubuntu 192.168.1.10/24. Telemetry chính đi bằng REST/HEC TCP/8000 và syslog UDP/5514; Splunk chỉ là nhánh nhận bản sao.</w:t>
       </w:r>
     </w:p>
     <w:p>
       <w:pPr>
         <w:pStyle w:val="TableCaption"/>
       </w:pPr>
-      <w:bookmarkStart w:id="30" w:name="_Toc236262506"/>
+      <w:bookmarkStart w:id="30" w:name="_Toc236263702"/>
       <w:r>
         <w:rPr>
           <w:lang w:val="vi-VN" w:eastAsia="vi-VN"/>
@@ -15743,7 +15751,7 @@
         <w:pStyle w:val="Heading2"/>
         <w:pageBreakBefore/>
       </w:pPr>
-      <w:bookmarkStart w:id="31" w:name="_Toc236262453"/>
+      <w:bookmarkStart w:id="31" w:name="_Toc236263649"/>
       <w:r>
         <w:rPr>
           <w:rFonts w:ascii="Times New Roman" w:eastAsia="Times New Roman" w:hAnsi="Times New Roman"/>
@@ -15767,7 +15775,7 @@
           <wp:inline distT="0" distB="0" distL="0" distR="0">
             <wp:extent cx="5532120" cy="7068820"/>
             <wp:effectExtent l="0" t="0" r="0" b="0"/>
-            <wp:docPr id="24" name="Picture 24" descr="Sơ đồ mô tả luồng từ Kali attacker qua OPNsense, Web/Windows target, telemetry trực tiếp về Ubuntu A11 SOC, xử lý SOCPipeline, RAG/Local LLM, tạo incident/report, approval gate và phản ứng qua n8n hoặc OPNsense. Splunk chỉ là nhánh quan sát bản sao log." title="Sơ đồ luồng end-to-end local-first có RAG và n8n"/>
+            <wp:docPr id="27" name="Picture 27" descr="Luồng end-to-end từ tấn công, sinh log, ingest local, xử lý real-time, RAG, incident, approval, n8n và báo cáo." title="Luồng end-to-end từ tấn công, sinh log, ingest local, xử lý real-time, RAG, incident, approval, n8n và báo cáo."/>
             <wp:cNvGraphicFramePr>
               <a:graphicFrameLocks xmlns:a="http://schemas.openxmlformats.org/drawingml/2006/main" noChangeAspect="1"/>
             </wp:cNvGraphicFramePr>
@@ -15804,8 +15812,11 @@
       <w:pPr>
         <w:pStyle w:val="FigureCaption"/>
       </w:pPr>
-      <w:bookmarkStart w:id="32" w:name="_Toc236262523"/>
+      <w:bookmarkStart w:id="32" w:name="_Toc236263719"/>
       <w:r>
+        <w:rPr>
+          <w:sz w:val="20"/>
+        </w:rPr>
         <w:t>Hình 2.3. Sơ đồ luồng tổng quát từ tấn công đến phản ứng và báo cáo</w:t>
       </w:r>
       <w:bookmarkEnd w:id="32"/>
@@ -15857,20 +15868,6 @@
         <w:spacing w:after="120" w:line="264" w:lineRule="auto"/>
       </w:pPr>
       <w:r>
-        <w:t>Nhánh n8n trong sơ đồ không thay thế lõi phát hiện mà đóng vai trò orchestration sau kh</w:t>
-      </w:r>
-      <w:r>
-        <w:t>i SOC đã tạo action. Workflow A11 SOC Local Automation nhận hai webhook production: /webhook/a11-soc-alert để ghi nhận cảnh báo High/Critical và /webhook/a11-soc-response để xử lý action đã được analyst phê duyệt. Mỗi execution gọi ngược /api/v1/automation</w:t>
-      </w:r>
-      <w:r>
-        <w:t>/audit để lưu kết quả vào AuditEvent, nhờ đó báo cáo sự cố có đủ bằng chứng từ tấn công, phát hiện, phê duyệt đến phản ứng.</w:t>
-      </w:r>
-    </w:p>
-    <w:p>
-      <w:pPr>
-        <w:spacing w:after="120" w:line="264" w:lineRule="auto"/>
-      </w:pPr>
-      <w:r>
         <w:t>Nhánh n8n trong sơ đồ không thay thế lõi phát hiện mà đóng vai trò orchestration sau khi SOC đã tạo action. Workflow A11 SOC Local Automation nhận hai webhook production: /webhook/a11-soc-alert để ghi nhận cảnh báo High/Critical và /webhook/a11-soc-response để xử lý action đã được analyst phê duyệt. Mỗi execution gọi ngược /api/v1/automation/audit để lưu kết quả vào AuditEvent, nhờ đó báo cáo sự cố có đủ bằng chứng từ tấn công, phát hiện, phê duyệt đến phản ứng.</w:t>
       </w:r>
     </w:p>
@@ -15878,7 +15875,7 @@
       <w:pPr>
         <w:pStyle w:val="Heading2"/>
       </w:pPr>
-      <w:bookmarkStart w:id="33" w:name="_Toc236262454"/>
+      <w:bookmarkStart w:id="33" w:name="_Toc236263650"/>
       <w:r>
         <w:rPr>
           <w:rFonts w:ascii="Times New Roman" w:eastAsia="Times New Roman" w:hAnsi="Times New Roman"/>
@@ -15900,9 +15897,9 @@
         </w:rPr>
         <w:drawing>
           <wp:inline distT="0" distB="0" distL="0" distR="0">
-            <wp:extent cx="5532120" cy="3227070"/>
+            <wp:extent cx="5532120" cy="3626612"/>
             <wp:effectExtent l="0" t="0" r="0" b="0"/>
-            <wp:docPr id="6" name="Picture 6" descr="Orchestrator trung tâm phối hợp Triage, Enrichment, RAG, Report và Response Agent qua policy và approval gate" title="Mô hình phối hợp các agent"/>
+            <wp:docPr id="28" name="Picture 28" descr="Mô hình phối hợp các agent trong SOCPipeline, RAG knowledge base, local LLM, approval gate, n8n và audit." title="Mô hình phối hợp các agent trong SOCPipeline, RAG knowledge base, local LLM, approval gate, n8n và audit."/>
             <wp:cNvGraphicFramePr>
               <a:graphicFrameLocks xmlns:a="http://schemas.openxmlformats.org/drawingml/2006/main" noChangeAspect="1"/>
             </wp:cNvGraphicFramePr>
@@ -15922,7 +15919,7 @@
                   <pic:spPr>
                     <a:xfrm>
                       <a:off x="0" y="0"/>
-                      <a:ext cx="5532120" cy="3227070"/>
+                      <a:ext cx="5532120" cy="3626612"/>
                     </a:xfrm>
                     <a:prstGeom prst="rect">
                       <a:avLst/>
@@ -15939,12 +15936,12 @@
       <w:pPr>
         <w:pStyle w:val="FigureCaption"/>
       </w:pPr>
-      <w:bookmarkStart w:id="34" w:name="_Toc236262524"/>
+      <w:bookmarkStart w:id="34" w:name="_Toc236263720"/>
       <w:r>
         <w:rPr>
-          <w:lang w:val="vi-VN" w:eastAsia="vi-VN"/>
+          <w:sz w:val="20"/>
         </w:rPr>
-        <w:t>Hình 2.4. Mô hình phối hợp các agent</w:t>
+        <w:t>Hình 2.4. Mô hình phối hợp SOCPipeline, RAG và n8n</w:t>
       </w:r>
       <w:bookmarkEnd w:id="34"/>
     </w:p>
@@ -15961,20 +15958,20 @@
     </w:p>
     <w:p>
       <w:pPr>
-        <w:ind w:firstLine="567"/>
+        <w:ind w:firstLine="432"/>
       </w:pPr>
       <w:r>
         <w:rPr>
-          <w:lang w:val="vi-VN" w:eastAsia="vi-VN"/>
+          <w:sz w:val="22"/>
         </w:rPr>
-        <w:t>Orchestrator được hiện thực trong SOCPipeline. Thứ tự gọi agent là xác định để tránh vòng lặp không kiểm soát. Triage nhận normalized event và enrichment sơ bộ; Enrichment đọc assets/IOCs; RAG truy vấn playbook theo từ khóa; LocalLLMAgent nhận context đã giới hạn; Report Agent kết xuất Markdown; Response Agent chỉ tạo action trong danh sách cho phép. Approval gate nằm ngoài LLM và được kiểm tra lần nữa trước execution.</w:t>
+        <w:t>Hình 2.4 cho thấy SOCPipeline là điều phối trung tâm: sau khi sự kiện được chuẩn hóa, pipeline gọi Triage, Enrichment, RAG Agent và Local LLM/fallback theo thứ tự xác định. Đầu ra là alert/incident/report và response action dạng proposal. Với hành động rủi ro cao như block_ip hoặc isolate_host, hệ thống bắt buộc approval trước khi n8n hoặc adapter OPNsense thực thi.</w:t>
       </w:r>
     </w:p>
     <w:p>
       <w:pPr>
         <w:pStyle w:val="TableCaption"/>
       </w:pPr>
-      <w:bookmarkStart w:id="35" w:name="_Toc236262507"/>
+      <w:bookmarkStart w:id="35" w:name="_Toc236263703"/>
       <w:r>
         <w:rPr>
           <w:lang w:val="vi-VN" w:eastAsia="vi-VN"/>
@@ -16795,7 +16792,7 @@
       <w:pPr>
         <w:pStyle w:val="Heading2"/>
       </w:pPr>
-      <w:bookmarkStart w:id="36" w:name="_Toc236262455"/>
+      <w:bookmarkStart w:id="36" w:name="_Toc236263651"/>
       <w:r>
         <w:rPr>
           <w:rFonts w:ascii="Times New Roman" w:eastAsia="Times New Roman" w:hAnsi="Times New Roman"/>
@@ -16856,7 +16853,7 @@
       <w:pPr>
         <w:pStyle w:val="FigureCaption"/>
       </w:pPr>
-      <w:bookmarkStart w:id="37" w:name="_Toc236262525"/>
+      <w:bookmarkStart w:id="37" w:name="_Toc236263721"/>
       <w:r>
         <w:rPr>
           <w:lang w:val="vi-VN" w:eastAsia="vi-VN"/>
@@ -16891,7 +16888,7 @@
       <w:pPr>
         <w:pStyle w:val="Heading2"/>
       </w:pPr>
-      <w:bookmarkStart w:id="38" w:name="_Toc236262456"/>
+      <w:bookmarkStart w:id="38" w:name="_Toc236263652"/>
       <w:r>
         <w:rPr>
           <w:rFonts w:ascii="Times New Roman" w:eastAsia="Times New Roman" w:hAnsi="Times New Roman"/>
@@ -16916,7 +16913,7 @@
       <w:pPr>
         <w:pStyle w:val="TableCaption"/>
       </w:pPr>
-      <w:bookmarkStart w:id="39" w:name="_Toc236262508"/>
+      <w:bookmarkStart w:id="39" w:name="_Toc236263704"/>
       <w:r>
         <w:rPr>
           <w:lang w:val="vi-VN" w:eastAsia="vi-VN"/>
@@ -17730,7 +17727,7 @@
       <w:pPr>
         <w:pStyle w:val="Heading3"/>
       </w:pPr>
-      <w:bookmarkStart w:id="40" w:name="_Toc236262457"/>
+      <w:bookmarkStart w:id="40" w:name="_Toc236263653"/>
       <w:r>
         <w:t>2.9.1. Chiến lược dataset và huấn luyện mô hình</w:t>
       </w:r>
@@ -17826,7 +17823,7 @@
       <w:pPr>
         <w:pStyle w:val="Heading2"/>
       </w:pPr>
-      <w:bookmarkStart w:id="41" w:name="_Toc236262458"/>
+      <w:bookmarkStart w:id="41" w:name="_Toc236263654"/>
       <w:r>
         <w:rPr>
           <w:rFonts w:ascii="Times New Roman" w:eastAsia="Times New Roman" w:hAnsi="Times New Roman"/>
@@ -17841,7 +17838,7 @@
       <w:pPr>
         <w:pStyle w:val="TableCaption"/>
       </w:pPr>
-      <w:bookmarkStart w:id="42" w:name="_Toc236262509"/>
+      <w:bookmarkStart w:id="42" w:name="_Toc236263705"/>
       <w:r>
         <w:rPr>
           <w:lang w:val="vi-VN" w:eastAsia="vi-VN"/>
@@ -18475,7 +18472,7 @@
       <w:pPr>
         <w:pStyle w:val="Heading2"/>
       </w:pPr>
-      <w:bookmarkStart w:id="43" w:name="_Toc236262459"/>
+      <w:bookmarkStart w:id="43" w:name="_Toc236263655"/>
       <w:r>
         <w:rPr>
           <w:rFonts w:ascii="Times New Roman" w:eastAsia="Times New Roman" w:hAnsi="Times New Roman"/>
@@ -18512,7 +18509,7 @@
       <w:pPr>
         <w:pStyle w:val="Heading1"/>
       </w:pPr>
-      <w:bookmarkStart w:id="44" w:name="_Toc236262460"/>
+      <w:bookmarkStart w:id="44" w:name="_Toc236263656"/>
       <w:r>
         <w:rPr>
           <w:rFonts w:ascii="Times New Roman" w:eastAsia="Times New Roman" w:hAnsi="Times New Roman"/>
@@ -18527,7 +18524,7 @@
       <w:pPr>
         <w:pStyle w:val="Heading2"/>
       </w:pPr>
-      <w:bookmarkStart w:id="45" w:name="_Toc236262461"/>
+      <w:bookmarkStart w:id="45" w:name="_Toc236263657"/>
       <w:r>
         <w:rPr>
           <w:rFonts w:ascii="Times New Roman" w:eastAsia="Times New Roman" w:hAnsi="Times New Roman"/>
@@ -18541,7 +18538,7 @@
       <w:pPr>
         <w:pStyle w:val="TableCaption"/>
       </w:pPr>
-      <w:bookmarkStart w:id="46" w:name="_Toc236262510"/>
+      <w:bookmarkStart w:id="46" w:name="_Toc236263706"/>
       <w:r>
         <w:rPr>
           <w:lang w:val="vi-VN" w:eastAsia="vi-VN"/>
@@ -19240,7 +19237,7 @@
       <w:pPr>
         <w:pStyle w:val="Heading2"/>
       </w:pPr>
-      <w:bookmarkStart w:id="47" w:name="_Toc236262462"/>
+      <w:bookmarkStart w:id="47" w:name="_Toc236263658"/>
       <w:r>
         <w:rPr>
           <w:rFonts w:ascii="Times New Roman" w:eastAsia="Times New Roman" w:hAnsi="Times New Roman"/>
@@ -19312,7 +19309,7 @@
       <w:pPr>
         <w:pStyle w:val="FigureCaption"/>
       </w:pPr>
-      <w:bookmarkStart w:id="48" w:name="_Toc236262526"/>
+      <w:bookmarkStart w:id="48" w:name="_Toc236263722"/>
       <w:r>
         <w:rPr>
           <w:lang w:val="vi-VN" w:eastAsia="vi-VN"/>
@@ -19394,7 +19391,7 @@
       <w:pPr>
         <w:pStyle w:val="FigureCaption"/>
       </w:pPr>
-      <w:bookmarkStart w:id="49" w:name="_Toc236262527"/>
+      <w:bookmarkStart w:id="49" w:name="_Toc236263723"/>
       <w:r>
         <w:rPr>
           <w:lang w:val="vi-VN" w:eastAsia="vi-VN"/>
@@ -19418,7 +19415,7 @@
       <w:pPr>
         <w:pStyle w:val="Heading2"/>
       </w:pPr>
-      <w:bookmarkStart w:id="50" w:name="_Toc236262463"/>
+      <w:bookmarkStart w:id="50" w:name="_Toc236263659"/>
       <w:r>
         <w:rPr>
           <w:rFonts w:ascii="Times New Roman" w:eastAsia="Times New Roman" w:hAnsi="Times New Roman"/>
@@ -19604,7 +19601,7 @@
       <w:pPr>
         <w:pStyle w:val="FigureCaption"/>
       </w:pPr>
-      <w:bookmarkStart w:id="51" w:name="_Toc236262528"/>
+      <w:bookmarkStart w:id="51" w:name="_Toc236263724"/>
       <w:r>
         <w:rPr>
           <w:lang w:val="vi-VN" w:eastAsia="vi-VN"/>
@@ -19628,7 +19625,7 @@
       <w:pPr>
         <w:pStyle w:val="Heading2"/>
       </w:pPr>
-      <w:bookmarkStart w:id="52" w:name="_Toc236262464"/>
+      <w:bookmarkStart w:id="52" w:name="_Toc236263660"/>
       <w:r>
         <w:rPr>
           <w:rFonts w:ascii="Times New Roman" w:eastAsia="Times New Roman" w:hAnsi="Times New Roman"/>
@@ -19700,7 +19697,7 @@
       <w:pPr>
         <w:pStyle w:val="FigureCaption"/>
       </w:pPr>
-      <w:bookmarkStart w:id="53" w:name="_Toc236262529"/>
+      <w:bookmarkStart w:id="53" w:name="_Toc236263725"/>
       <w:r>
         <w:rPr>
           <w:lang w:val="vi-VN" w:eastAsia="vi-VN"/>
@@ -19771,7 +19768,7 @@
       <w:pPr>
         <w:pStyle w:val="FigureCaption"/>
       </w:pPr>
-      <w:bookmarkStart w:id="54" w:name="_Toc236262530"/>
+      <w:bookmarkStart w:id="54" w:name="_Toc236263726"/>
       <w:r>
         <w:rPr>
           <w:lang w:val="vi-VN" w:eastAsia="vi-VN"/>
@@ -19842,7 +19839,7 @@
       <w:pPr>
         <w:pStyle w:val="FigureCaption"/>
       </w:pPr>
-      <w:bookmarkStart w:id="55" w:name="_Toc236262531"/>
+      <w:bookmarkStart w:id="55" w:name="_Toc236263727"/>
       <w:r>
         <w:rPr>
           <w:lang w:val="vi-VN" w:eastAsia="vi-VN"/>
@@ -19866,7 +19863,7 @@
       <w:pPr>
         <w:pStyle w:val="Heading2"/>
       </w:pPr>
-      <w:bookmarkStart w:id="56" w:name="_Toc236262465"/>
+      <w:bookmarkStart w:id="56" w:name="_Toc236263661"/>
       <w:r>
         <w:rPr>
           <w:rFonts w:ascii="Times New Roman" w:eastAsia="Times New Roman" w:hAnsi="Times New Roman"/>
@@ -19938,7 +19935,7 @@
       <w:pPr>
         <w:pStyle w:val="FigureCaption"/>
       </w:pPr>
-      <w:bookmarkStart w:id="57" w:name="_Toc236262532"/>
+      <w:bookmarkStart w:id="57" w:name="_Toc236263728"/>
       <w:r>
         <w:rPr>
           <w:lang w:val="vi-VN" w:eastAsia="vi-VN"/>
@@ -20017,7 +20014,7 @@
       <w:pPr>
         <w:pStyle w:val="FigureCaption"/>
       </w:pPr>
-      <w:bookmarkStart w:id="58" w:name="_Toc236262533"/>
+      <w:bookmarkStart w:id="58" w:name="_Toc236263729"/>
       <w:r>
         <w:rPr>
           <w:lang w:val="vi-VN" w:eastAsia="vi-VN"/>
@@ -20087,7 +20084,7 @@
       <w:pPr>
         <w:pStyle w:val="FigureCaption"/>
       </w:pPr>
-      <w:bookmarkStart w:id="59" w:name="_Toc236262534"/>
+      <w:bookmarkStart w:id="59" w:name="_Toc236263730"/>
       <w:r>
         <w:rPr>
           <w:lang w:val="vi-VN" w:eastAsia="vi-VN"/>
@@ -20119,7 +20116,7 @@
       <w:pPr>
         <w:pStyle w:val="Heading2"/>
       </w:pPr>
-      <w:bookmarkStart w:id="60" w:name="_Toc236262466"/>
+      <w:bookmarkStart w:id="60" w:name="_Toc236263662"/>
       <w:r>
         <w:rPr>
           <w:rFonts w:ascii="Times New Roman" w:eastAsia="Times New Roman" w:hAnsi="Times New Roman"/>
@@ -20141,9 +20138,9 @@
         </w:rPr>
         <w:drawing>
           <wp:inline distT="0" distB="0" distL="0" distR="0">
-            <wp:extent cx="5532120" cy="3227070"/>
+            <wp:extent cx="5532120" cy="3626612"/>
             <wp:effectExtent l="0" t="0" r="0" b="0"/>
-            <wp:docPr id="17" name="Picture 17" descr="Các container API dashboard, PostgreSQL, Ollama, n8n và Splunk poller trên mạng nội bộ" title="Kiến trúc triển khai bằng Docker Compose"/>
+            <wp:docPr id="29" name="Picture 29" descr="Kiến trúc triển khai Docker Compose trên Ubuntu Server gồm api, postgres, n8n, ollama tùy chọn, Splunk quan sát tùy chọn." title="Kiến trúc triển khai Docker Compose trên Ubuntu Server gồm api, postgres, n8n, ollama tùy chọn, Splunk quan sát tùy chọn."/>
             <wp:cNvGraphicFramePr>
               <a:graphicFrameLocks xmlns:a="http://schemas.openxmlformats.org/drawingml/2006/main" noChangeAspect="1"/>
             </wp:cNvGraphicFramePr>
@@ -20163,7 +20160,7 @@
                   <pic:spPr>
                     <a:xfrm>
                       <a:off x="0" y="0"/>
-                      <a:ext cx="5532120" cy="3227070"/>
+                      <a:ext cx="5532120" cy="3626612"/>
                     </a:xfrm>
                     <a:prstGeom prst="rect">
                       <a:avLst/>
@@ -20180,12 +20177,12 @@
       <w:pPr>
         <w:pStyle w:val="FigureCaption"/>
       </w:pPr>
-      <w:bookmarkStart w:id="61" w:name="_Toc236262535"/>
+      <w:bookmarkStart w:id="61" w:name="_Toc236263731"/>
       <w:r>
         <w:rPr>
-          <w:lang w:val="vi-VN" w:eastAsia="vi-VN"/>
+          <w:sz w:val="20"/>
         </w:rPr>
-        <w:t>Hình 3.10. Kiến trúc triển khai bằng Docker Compose</w:t>
+        <w:t>Hình 3.10. Docker Compose trên Ubuntu Server với n8n workflow</w:t>
       </w:r>
       <w:bookmarkEnd w:id="61"/>
     </w:p>
@@ -20202,20 +20199,20 @@
     </w:p>
     <w:p>
       <w:pPr>
-        <w:ind w:firstLine="567"/>
+        <w:ind w:firstLine="432"/>
       </w:pPr>
       <w:r>
         <w:rPr>
-          <w:lang w:val="vi-VN" w:eastAsia="vi-VN"/>
+          <w:sz w:val="22"/>
         </w:rPr>
-        <w:t>Compose mặc định khởi động api và postgres. API chỉ publish HTTP tới địa chỉ do SOC_HTTP_BIND cấu hình, mặc định 127.0.0.1; syslog publish UDP 5514. Data và knowledge được mount read-only. Ollama nằm trong profile ai, n8n trong automation, poller trong splunk. Profile giúp môi trường tối thiểu không phải tải các thành phần không cần. Healthcheck bảo đảm API chỉ khởi động sau khi PostgreSQL sẵn sàng.</w:t>
+        <w:t>Hình 3.10 thể hiện triển khai chuẩn khi clone repository về Ubuntu Server: Docker Compose khởi động api và postgres theo mặc định; n8n nằm trong profile automation; Ollama nằm trong profile ai; Splunk/poller là nhánh quan sát tùy chọn. API publish HTTP theo SOC_HTTP_BIND, syslog UDP/5514 nhận log cục bộ, data và knowledge được mount vào container để bảo toàn bằng chứng và playbook.</w:t>
       </w:r>
     </w:p>
     <w:p>
       <w:pPr>
         <w:pStyle w:val="TableCaption"/>
       </w:pPr>
-      <w:bookmarkStart w:id="62" w:name="_Toc236262511"/>
+      <w:bookmarkStart w:id="62" w:name="_Toc236263707"/>
       <w:r>
         <w:rPr>
           <w:lang w:val="vi-VN" w:eastAsia="vi-VN"/>
@@ -20910,7 +20907,7 @@
       <w:pPr>
         <w:pStyle w:val="Heading2"/>
       </w:pPr>
-      <w:bookmarkStart w:id="63" w:name="_Toc236262467"/>
+      <w:bookmarkStart w:id="63" w:name="_Toc236263663"/>
       <w:r>
         <w:rPr>
           <w:rFonts w:ascii="Times New Roman" w:eastAsia="Times New Roman" w:hAnsi="Times New Roman"/>
@@ -20928,14 +20925,14 @@
         <w:rPr>
           <w:lang w:val="vi-VN" w:eastAsia="vi-VN"/>
         </w:rPr>
-        <w:t xml:space="preserve">FastAPI cung cấp lifespan để khởi tạo database, pipeline và UDP endpoint. HEC parser hỗ trợ một JSON object hoặc nhiều object nối tiếp nhau, phù hợp kiểu gửi </w:t>
+        <w:t xml:space="preserve">FastAPI cung cấp lifespan để khởi tạo database, pipeline và UDP endpoint. HEC parser hỗ trợ một JSON object hoặc nhiều object nối tiếp nhau, phù hợp kiểu gửi batch. Syslog dùng asyncio DatagramProtocol, chuyển payload tới cùng pipeline. </w:t>
       </w:r>
       <w:r>
         <w:rPr>
           <w:lang w:val="vi-VN" w:eastAsia="vi-VN"/>
         </w:rPr>
         <w:lastRenderedPageBreak/>
-        <w:t>batch. Syslog dùng asyncio DatagramProtocol, chuyển payload tới cùng pipeline. normalize_event tự nhận dạng Apache combined log, Suricata EVE, Windows event và JSON tổng quát. Timestamp được chuẩn hóa UTC khi có thể; source_hint chỉ hỗ trợ định tuyến và không được tin cậy để bỏ qua validation.</w:t>
+        <w:t>normalize_event tự nhận dạng Apache combined log, Suricata EVE, Windows event và JSON tổng quát. Timestamp được chuẩn hóa UTC khi có thể; source_hint chỉ hỗ trợ định tuyến và không được tin cậy để bỏ qua validation.</w:t>
       </w:r>
     </w:p>
     <w:tbl>
@@ -21087,7 +21084,7 @@
       <w:pPr>
         <w:pStyle w:val="Heading2"/>
       </w:pPr>
-      <w:bookmarkStart w:id="64" w:name="_Toc236262468"/>
+      <w:bookmarkStart w:id="64" w:name="_Toc236263664"/>
       <w:r>
         <w:rPr>
           <w:rFonts w:ascii="Times New Roman" w:eastAsia="Times New Roman" w:hAnsi="Times New Roman"/>
@@ -21113,7 +21110,7 @@
         <w:pStyle w:val="Heading3"/>
         <w:spacing w:after="120" w:line="264" w:lineRule="auto"/>
       </w:pPr>
-      <w:bookmarkStart w:id="65" w:name="_Toc236262469"/>
+      <w:bookmarkStart w:id="65" w:name="_Toc236263665"/>
       <w:r>
         <w:t>3.8.1. Knowledge Base và RAG agent hiện thực</w:t>
       </w:r>
@@ -21131,7 +21128,7 @@
       <w:pPr>
         <w:pStyle w:val="TableCaption"/>
       </w:pPr>
-      <w:bookmarkStart w:id="66" w:name="_Toc236262512"/>
+      <w:bookmarkStart w:id="66" w:name="_Toc236263708"/>
       <w:r>
         <w:rPr>
           <w:lang w:val="vi-VN" w:eastAsia="vi-VN"/>
@@ -21689,7 +21686,6 @@
                 <w:sz w:val="18"/>
                 <w:lang w:val="vi-VN" w:eastAsia="vi-VN"/>
               </w:rPr>
-              <w:lastRenderedPageBreak/>
               <w:t>knowledge</w:t>
             </w:r>
           </w:p>
@@ -21773,6 +21769,7 @@
                 <w:sz w:val="18"/>
                 <w:lang w:val="vi-VN" w:eastAsia="vi-VN"/>
               </w:rPr>
+              <w:lastRenderedPageBreak/>
               <w:t>disposition</w:t>
             </w:r>
           </w:p>
@@ -21844,7 +21841,7 @@
       <w:pPr>
         <w:pStyle w:val="Heading2"/>
       </w:pPr>
-      <w:bookmarkStart w:id="67" w:name="_Toc236262470"/>
+      <w:bookmarkStart w:id="67" w:name="_Toc236263666"/>
       <w:r>
         <w:rPr>
           <w:rFonts w:ascii="Times New Roman" w:eastAsia="Times New Roman" w:hAnsi="Times New Roman"/>
@@ -21869,7 +21866,7 @@
       <w:pPr>
         <w:pStyle w:val="Heading2"/>
       </w:pPr>
-      <w:bookmarkStart w:id="68" w:name="_Toc236262471"/>
+      <w:bookmarkStart w:id="68" w:name="_Toc236263667"/>
       <w:r>
         <w:rPr>
           <w:rFonts w:ascii="Times New Roman" w:eastAsia="Times New Roman" w:hAnsi="Times New Roman"/>
@@ -21890,9 +21887,9 @@
         </w:rPr>
         <w:drawing>
           <wp:inline distT="0" distB="0" distL="0" distR="0">
-            <wp:extent cx="5532120" cy="3227070"/>
+            <wp:extent cx="5532120" cy="3626612"/>
             <wp:effectExtent l="0" t="0" r="0" b="0"/>
-            <wp:docPr id="18" name="Picture 18" descr="Kali gửi lưu lượng qua OPNsense, Apache tạo log, Splunk và SOC phân tích, analyst phê duyệt action" title="Sequence từ tấn công đến phê duyệt phản ứng"/>
+            <wp:docPr id="30" name="Picture 30" descr="Sequence xử lý sự kiện từ attacker đến collector, SOCPipeline, RAG/agent, analyst approval, n8n execution và audit callback." title="Sequence xử lý sự kiện từ attacker đến collector, SOCPipeline, RAG/agent, analyst approval, n8n execution và audit callback."/>
             <wp:cNvGraphicFramePr>
               <a:graphicFrameLocks xmlns:a="http://schemas.openxmlformats.org/drawingml/2006/main" noChangeAspect="1"/>
             </wp:cNvGraphicFramePr>
@@ -21912,7 +21909,7 @@
                   <pic:spPr>
                     <a:xfrm>
                       <a:off x="0" y="0"/>
-                      <a:ext cx="5532120" cy="3227070"/>
+                      <a:ext cx="5532120" cy="3626612"/>
                     </a:xfrm>
                     <a:prstGeom prst="rect">
                       <a:avLst/>
@@ -21929,12 +21926,12 @@
       <w:pPr>
         <w:pStyle w:val="FigureCaption"/>
       </w:pPr>
-      <w:bookmarkStart w:id="69" w:name="_Toc236262536"/>
+      <w:bookmarkStart w:id="69" w:name="_Toc236263732"/>
       <w:r>
         <w:rPr>
-          <w:lang w:val="vi-VN" w:eastAsia="vi-VN"/>
+          <w:sz w:val="20"/>
         </w:rPr>
-        <w:t>Hình 3.11. Sequence từ tấn công đến phê duyệt phản ứng</w:t>
+        <w:t>Hình 3.11. Sequence từ tấn công đến RAG, approval, n8n và audit</w:t>
       </w:r>
       <w:bookmarkEnd w:id="69"/>
     </w:p>
@@ -21951,13 +21948,13 @@
     </w:p>
     <w:p>
       <w:pPr>
-        <w:ind w:firstLine="567"/>
+        <w:ind w:firstLine="432"/>
       </w:pPr>
       <w:r>
         <w:rPr>
-          <w:lang w:val="vi-VN" w:eastAsia="vi-VN"/>
+          <w:sz w:val="22"/>
         </w:rPr>
-        <w:t>Report Agent tạo Markdown gồm tóm tắt, mức độ, nguồn, timeline, MITRE, bằng chứng, nhận định, hành động và khuyến nghị. Response Agent tự sinh notify cho High/Critical; block_ip chỉ được đề xuất nếu target là IP public hợp lệ; isolate_host dành cho sự kiện Critical có host. Action risk cao đặt approval_required=true và status=pending. Analyst approve hoặc reject qua API/dashboard; executor sau đó chạy dry_run, webhook hoặc thêm IP vào alias OPNsense.</w:t>
+        <w:t>Hình 3.11 mô tả sequence phản ứng: attacker tạo Nmap/DIRB/brute force; Web, Windows hoặc OPNsense sinh log; Collector xác thực và chuyển sự kiện vào SOCPipeline; pipeline dedup/correlate trong cửa sổ 300 giây, truy xuất RAG playbook, sinh severity/MITRE/recommendation, rồi tạo incident và action. Analyst phê duyệt trước khi n8n/adapter thực thi; kết quả được ghi ngược vào AuditEvent để Report Agent tổng hợp timeline, bằng chứng và khuyến nghị.</w:t>
       </w:r>
     </w:p>
     <w:p>
@@ -21965,7 +21962,7 @@
         <w:pStyle w:val="Heading3"/>
         <w:spacing w:after="120" w:line="264" w:lineRule="auto"/>
       </w:pPr>
-      <w:bookmarkStart w:id="70" w:name="_Toc236262472"/>
+      <w:bookmarkStart w:id="70" w:name="_Toc236263668"/>
       <w:r>
         <w:t>3.10.1. Workflow n8n và cơ chế audit ngược</w:t>
       </w:r>
@@ -21976,11 +21973,11 @@
         <w:spacing w:after="120" w:line="264" w:lineRule="auto"/>
       </w:pPr>
       <w:r>
-        <w:t xml:space="preserve">Workflow n8n được đóng gói riêng trong repository tại n8n/workflows/a11_soc_local_automation.json. Khi chạy Docker Compose profile </w:t>
+        <w:t xml:space="preserve">Workflow n8n được đóng gói riêng trong repository tại n8n/workflows/a11_soc_local_automation.json. Khi chạy Docker Compose profile automation, n8n dùng biến A11_SOC_API_URL=http://api:8000 và </w:t>
       </w:r>
       <w:r>
         <w:lastRenderedPageBreak/>
-        <w:t>automation, n8n dùng biến A11_SOC_API_URL=http://api:8000 và A11_SOC_ADMIN_TOKEN để gọi lại API audit. Với RESPONSE_MODE=webhook, ResponseExecutor gửi payload {action_type, target, payload} tới http://n8n:5678/webhook/a11-soc-response; với notify_soc, hệ thống gửi cảnh báo tới http://n8n:5678/webhook/a11-soc-alert. Luồng này giúp demo SOAR local nhưng vẫn giữ nguyên human-in-the-loop: block_ip và isolate_host chỉ chạy sau khi analyst approve.</w:t>
+        <w:t>A11_SOC_ADMIN_TOKEN để gọi lại API audit. Với RESPONSE_MODE=webhook, ResponseExecutor gửi payload {action_type, target, payload} tới http://n8n:5678/webhook/a11-soc-response; với notify_soc, hệ thống gửi cảnh báo tới http://n8n:5678/webhook/a11-soc-alert. Luồng này giúp demo SOAR local nhưng vẫn giữ nguyên human-in-the-loop: block_ip và isolate_host chỉ chạy sau khi analyst approve.</w:t>
       </w:r>
     </w:p>
     <w:p>
@@ -21994,9 +21991,9 @@
         </w:rPr>
         <w:drawing>
           <wp:inline distT="0" distB="0" distL="0" distR="0">
-            <wp:extent cx="5532120" cy="3227070"/>
+            <wp:extent cx="5532120" cy="3626612"/>
             <wp:effectExtent l="0" t="0" r="0" b="0"/>
-            <wp:docPr id="19" name="Picture 19" descr="Các trạng thái new, open, investigating, contained, false positive và closed cùng action proposal" title="Vòng đời alert, incident và response action"/>
+            <wp:docPr id="31" name="Picture 31" descr="Vòng đời dữ liệu từ raw event đến alert, incident, response action, execution, audit event, report và dashboard SSE." title="Vòng đời dữ liệu từ raw event đến alert, incident, response action, execution, audit event, report và dashboard SSE."/>
             <wp:cNvGraphicFramePr>
               <a:graphicFrameLocks xmlns:a="http://schemas.openxmlformats.org/drawingml/2006/main" noChangeAspect="1"/>
             </wp:cNvGraphicFramePr>
@@ -22016,7 +22013,7 @@
                   <pic:spPr>
                     <a:xfrm>
                       <a:off x="0" y="0"/>
-                      <a:ext cx="5532120" cy="3227070"/>
+                      <a:ext cx="5532120" cy="3626612"/>
                     </a:xfrm>
                     <a:prstGeom prst="rect">
                       <a:avLst/>
@@ -22033,12 +22030,12 @@
       <w:pPr>
         <w:pStyle w:val="FigureCaption"/>
       </w:pPr>
-      <w:bookmarkStart w:id="71" w:name="_Toc236262537"/>
+      <w:bookmarkStart w:id="71" w:name="_Toc236263733"/>
       <w:r>
         <w:rPr>
-          <w:lang w:val="vi-VN" w:eastAsia="vi-VN"/>
+          <w:sz w:val="20"/>
         </w:rPr>
-        <w:t>Hình 3.12. Vòng đời alert, incident và response action</w:t>
+        <w:t>Hình 3.12. Vòng đời alert, incident, response action và audit</w:t>
       </w:r>
       <w:bookmarkEnd w:id="71"/>
     </w:p>
@@ -22057,7 +22054,7 @@
       <w:pPr>
         <w:pStyle w:val="Heading2"/>
       </w:pPr>
-      <w:bookmarkStart w:id="72" w:name="_Toc236262473"/>
+      <w:bookmarkStart w:id="72" w:name="_Toc236263669"/>
       <w:r>
         <w:rPr>
           <w:rFonts w:ascii="Times New Roman" w:eastAsia="Times New Roman" w:hAnsi="Times New Roman"/>
@@ -22118,7 +22115,7 @@
       <w:pPr>
         <w:pStyle w:val="FigureCaption"/>
       </w:pPr>
-      <w:bookmarkStart w:id="73" w:name="_Toc236262538"/>
+      <w:bookmarkStart w:id="73" w:name="_Toc236263734"/>
       <w:r>
         <w:rPr>
           <w:lang w:val="vi-VN" w:eastAsia="vi-VN"/>
@@ -22153,7 +22150,7 @@
       <w:pPr>
         <w:pStyle w:val="Heading2"/>
       </w:pPr>
-      <w:bookmarkStart w:id="74" w:name="_Toc236262474"/>
+      <w:bookmarkStart w:id="74" w:name="_Toc236263670"/>
       <w:r>
         <w:rPr>
           <w:rFonts w:ascii="Times New Roman" w:eastAsia="Times New Roman" w:hAnsi="Times New Roman"/>
@@ -22222,7 +22219,7 @@
       <w:pPr>
         <w:pStyle w:val="FigureCaption"/>
       </w:pPr>
-      <w:bookmarkStart w:id="75" w:name="_Toc236262539"/>
+      <w:bookmarkStart w:id="75" w:name="_Toc236263735"/>
       <w:r>
         <w:rPr>
           <w:lang w:val="vi-VN" w:eastAsia="vi-VN"/>
@@ -22292,12 +22289,12 @@
       <w:pPr>
         <w:pStyle w:val="FigureCaption"/>
       </w:pPr>
-      <w:bookmarkStart w:id="76" w:name="_Toc236262540"/>
+      <w:bookmarkStart w:id="76" w:name="_Toc236263736"/>
       <w:r>
         <w:rPr>
-          <w:lang w:val="vi-VN" w:eastAsia="vi-VN"/>
+          <w:sz w:val="20"/>
         </w:rPr>
-        <w:t>Hình 3.15. Splunk Cloud hiển thị kết quả Apache access log</w:t>
+        <w:t>Hình 3.15. Splunk/SIEM quan sát bản sao Apache access log</w:t>
       </w:r>
       <w:bookmarkEnd w:id="76"/>
     </w:p>
@@ -22316,7 +22313,7 @@
       <w:pPr>
         <w:pStyle w:val="Heading2"/>
       </w:pPr>
-      <w:bookmarkStart w:id="77" w:name="_Toc236262475"/>
+      <w:bookmarkStart w:id="77" w:name="_Toc236263671"/>
       <w:r>
         <w:rPr>
           <w:rFonts w:ascii="Times New Roman" w:eastAsia="Times New Roman" w:hAnsi="Times New Roman"/>
@@ -22330,7 +22327,7 @@
       <w:pPr>
         <w:pStyle w:val="TableCaption"/>
       </w:pPr>
-      <w:bookmarkStart w:id="78" w:name="_Toc236262513"/>
+      <w:bookmarkStart w:id="78" w:name="_Toc236263709"/>
       <w:r>
         <w:rPr>
           <w:lang w:val="vi-VN" w:eastAsia="vi-VN"/>
@@ -23138,7 +23135,7 @@
       <w:pPr>
         <w:pStyle w:val="TableCaption"/>
       </w:pPr>
-      <w:bookmarkStart w:id="79" w:name="_Toc236262514"/>
+      <w:bookmarkStart w:id="79" w:name="_Toc236263710"/>
       <w:r>
         <w:rPr>
           <w:lang w:val="vi-VN" w:eastAsia="vi-VN"/>
@@ -23769,7 +23766,7 @@
       <w:pPr>
         <w:pStyle w:val="Heading2"/>
       </w:pPr>
-      <w:bookmarkStart w:id="80" w:name="_Toc236262476"/>
+      <w:bookmarkStart w:id="80" w:name="_Toc236263672"/>
       <w:r>
         <w:rPr>
           <w:rFonts w:ascii="Times New Roman" w:eastAsia="Times New Roman" w:hAnsi="Times New Roman"/>
@@ -23803,7 +23800,7 @@
       <w:pPr>
         <w:pStyle w:val="Heading1"/>
       </w:pPr>
-      <w:bookmarkStart w:id="81" w:name="_Toc236262477"/>
+      <w:bookmarkStart w:id="81" w:name="_Toc236263673"/>
       <w:r>
         <w:rPr>
           <w:rFonts w:ascii="Times New Roman" w:eastAsia="Times New Roman" w:hAnsi="Times New Roman"/>
@@ -23818,7 +23815,7 @@
       <w:pPr>
         <w:pStyle w:val="Heading2"/>
       </w:pPr>
-      <w:bookmarkStart w:id="82" w:name="_Toc236262478"/>
+      <w:bookmarkStart w:id="82" w:name="_Toc236263674"/>
       <w:r>
         <w:rPr>
           <w:rFonts w:ascii="Times New Roman" w:eastAsia="Times New Roman" w:hAnsi="Times New Roman"/>
@@ -23843,7 +23840,7 @@
       <w:pPr>
         <w:pStyle w:val="TableCaption"/>
       </w:pPr>
-      <w:bookmarkStart w:id="83" w:name="_Toc236262515"/>
+      <w:bookmarkStart w:id="83" w:name="_Toc236263711"/>
       <w:r>
         <w:rPr>
           <w:lang w:val="vi-VN" w:eastAsia="vi-VN"/>
@@ -24390,7 +24387,7 @@
       <w:pPr>
         <w:pStyle w:val="Heading2"/>
       </w:pPr>
-      <w:bookmarkStart w:id="84" w:name="_Toc236262479"/>
+      <w:bookmarkStart w:id="84" w:name="_Toc236263675"/>
       <w:r>
         <w:rPr>
           <w:rFonts w:ascii="Times New Roman" w:eastAsia="Times New Roman" w:hAnsi="Times New Roman"/>
@@ -24415,7 +24412,7 @@
       <w:pPr>
         <w:pStyle w:val="TableCaption"/>
       </w:pPr>
-      <w:bookmarkStart w:id="85" w:name="_Toc236262516"/>
+      <w:bookmarkStart w:id="85" w:name="_Toc236263712"/>
       <w:r>
         <w:rPr>
           <w:lang w:val="vi-VN" w:eastAsia="vi-VN"/>
@@ -25127,7 +25124,7 @@
       <w:pPr>
         <w:pStyle w:val="Heading2"/>
       </w:pPr>
-      <w:bookmarkStart w:id="86" w:name="_Toc236262480"/>
+      <w:bookmarkStart w:id="86" w:name="_Toc236263676"/>
       <w:r>
         <w:rPr>
           <w:rFonts w:ascii="Times New Roman" w:eastAsia="Times New Roman" w:hAnsi="Times New Roman"/>
@@ -25159,7 +25156,7 @@
       <w:pPr>
         <w:pStyle w:val="Heading2"/>
       </w:pPr>
-      <w:bookmarkStart w:id="87" w:name="_Toc236262481"/>
+      <w:bookmarkStart w:id="87" w:name="_Toc236263677"/>
       <w:r>
         <w:rPr>
           <w:rFonts w:ascii="Times New Roman" w:eastAsia="Times New Roman" w:hAnsi="Times New Roman"/>
@@ -25203,7 +25200,7 @@
       <w:pPr>
         <w:pStyle w:val="Heading2"/>
       </w:pPr>
-      <w:bookmarkStart w:id="88" w:name="_Toc236262482"/>
+      <w:bookmarkStart w:id="88" w:name="_Toc236263678"/>
       <w:r>
         <w:rPr>
           <w:rFonts w:ascii="Times New Roman" w:eastAsia="Times New Roman" w:hAnsi="Times New Roman"/>
@@ -25264,7 +25261,7 @@
       <w:pPr>
         <w:pStyle w:val="FigureCaption"/>
       </w:pPr>
-      <w:bookmarkStart w:id="89" w:name="_Toc236262541"/>
+      <w:bookmarkStart w:id="89" w:name="_Toc236263737"/>
       <w:r>
         <w:rPr>
           <w:lang w:val="vi-VN" w:eastAsia="vi-VN"/>
@@ -25299,7 +25296,7 @@
       <w:pPr>
         <w:pStyle w:val="TableCaption"/>
       </w:pPr>
-      <w:bookmarkStart w:id="90" w:name="_Toc236262517"/>
+      <w:bookmarkStart w:id="90" w:name="_Toc236263713"/>
       <w:r>
         <w:rPr>
           <w:lang w:val="vi-VN" w:eastAsia="vi-VN"/>
@@ -26019,7 +26016,7 @@
       <w:pPr>
         <w:pStyle w:val="Heading2"/>
       </w:pPr>
-      <w:bookmarkStart w:id="91" w:name="_Toc236262483"/>
+      <w:bookmarkStart w:id="91" w:name="_Toc236263679"/>
       <w:r>
         <w:rPr>
           <w:rFonts w:ascii="Times New Roman" w:eastAsia="Times New Roman" w:hAnsi="Times New Roman"/>
@@ -26034,7 +26031,7 @@
       <w:pPr>
         <w:pStyle w:val="TableCaption"/>
       </w:pPr>
-      <w:bookmarkStart w:id="92" w:name="_Toc236262518"/>
+      <w:bookmarkStart w:id="92" w:name="_Toc236263714"/>
       <w:r>
         <w:rPr>
           <w:lang w:val="vi-VN" w:eastAsia="vi-VN"/>
@@ -26286,13 +26283,7 @@
               <w:rPr>
                 <w:sz w:val="18"/>
               </w:rPr>
-              <w:t xml:space="preserve">FastAPI lõi; </w:t>
-            </w:r>
-            <w:r>
-              <w:rPr>
-                <w:sz w:val="18"/>
-              </w:rPr>
-              <w:t>n8n workflow riêng có alert webhook, response webhook và audit callback</w:t>
+              <w:t>FastAPI lõi; n8n workflow riêng có alert webhook, response webhook và audit callback</w:t>
             </w:r>
           </w:p>
         </w:tc>
@@ -26909,7 +26900,7 @@
       <w:pPr>
         <w:pStyle w:val="Heading2"/>
       </w:pPr>
-      <w:bookmarkStart w:id="93" w:name="_Toc236262484"/>
+      <w:bookmarkStart w:id="93" w:name="_Toc236263680"/>
       <w:r>
         <w:rPr>
           <w:rFonts w:ascii="Times New Roman" w:eastAsia="Times New Roman" w:hAnsi="Times New Roman"/>
@@ -26923,7 +26914,7 @@
       <w:pPr>
         <w:pStyle w:val="TableCaption"/>
       </w:pPr>
-      <w:bookmarkStart w:id="94" w:name="_Toc236262519"/>
+      <w:bookmarkStart w:id="94" w:name="_Toc236263715"/>
       <w:r>
         <w:rPr>
           <w:lang w:val="vi-VN" w:eastAsia="vi-VN"/>
@@ -27635,7 +27626,7 @@
       <w:pPr>
         <w:pStyle w:val="Heading2"/>
       </w:pPr>
-      <w:bookmarkStart w:id="95" w:name="_Toc236262485"/>
+      <w:bookmarkStart w:id="95" w:name="_Toc236263681"/>
       <w:r>
         <w:rPr>
           <w:rFonts w:ascii="Times New Roman" w:eastAsia="Times New Roman" w:hAnsi="Times New Roman"/>
@@ -27719,7 +27710,7 @@
       <w:pPr>
         <w:pStyle w:val="Heading2"/>
       </w:pPr>
-      <w:bookmarkStart w:id="96" w:name="_Toc236262486"/>
+      <w:bookmarkStart w:id="96" w:name="_Toc236263682"/>
       <w:r>
         <w:rPr>
           <w:rFonts w:ascii="Times New Roman" w:eastAsia="Times New Roman" w:hAnsi="Times New Roman"/>
@@ -27747,7 +27738,7 @@
       <w:pPr>
         <w:pStyle w:val="Heading2"/>
       </w:pPr>
-      <w:bookmarkStart w:id="97" w:name="_Toc236262487"/>
+      <w:bookmarkStart w:id="97" w:name="_Toc236263683"/>
       <w:r>
         <w:rPr>
           <w:rFonts w:ascii="Times New Roman" w:eastAsia="Times New Roman" w:hAnsi="Times New Roman"/>
@@ -27784,7 +27775,7 @@
       <w:pPr>
         <w:pStyle w:val="Heading1"/>
       </w:pPr>
-      <w:bookmarkStart w:id="98" w:name="_Toc236262488"/>
+      <w:bookmarkStart w:id="98" w:name="_Toc236263684"/>
       <w:r>
         <w:rPr>
           <w:rFonts w:ascii="Times New Roman" w:eastAsia="Times New Roman" w:hAnsi="Times New Roman"/>
@@ -27799,7 +27790,7 @@
       <w:pPr>
         <w:pStyle w:val="Heading2"/>
       </w:pPr>
-      <w:bookmarkStart w:id="99" w:name="_Toc236262489"/>
+      <w:bookmarkStart w:id="99" w:name="_Toc236263685"/>
       <w:r>
         <w:rPr>
           <w:rFonts w:ascii="Times New Roman" w:eastAsia="Times New Roman" w:hAnsi="Times New Roman"/>
@@ -27832,7 +27823,7 @@
       <w:pPr>
         <w:pStyle w:val="Heading2"/>
       </w:pPr>
-      <w:bookmarkStart w:id="100" w:name="_Toc236262490"/>
+      <w:bookmarkStart w:id="100" w:name="_Toc236263686"/>
       <w:r>
         <w:rPr>
           <w:rFonts w:ascii="Times New Roman" w:eastAsia="Times New Roman" w:hAnsi="Times New Roman"/>
@@ -27906,7 +27897,7 @@
       <w:pPr>
         <w:pStyle w:val="Heading2"/>
       </w:pPr>
-      <w:bookmarkStart w:id="101" w:name="_Toc236262491"/>
+      <w:bookmarkStart w:id="101" w:name="_Toc236263687"/>
       <w:r>
         <w:rPr>
           <w:rFonts w:ascii="Times New Roman" w:eastAsia="Times New Roman" w:hAnsi="Times New Roman"/>
@@ -27943,7 +27934,7 @@
       <w:pPr>
         <w:pStyle w:val="Heading1"/>
       </w:pPr>
-      <w:bookmarkStart w:id="102" w:name="_Toc236262492"/>
+      <w:bookmarkStart w:id="102" w:name="_Toc236263688"/>
       <w:r>
         <w:rPr>
           <w:rFonts w:ascii="Times New Roman" w:eastAsia="Times New Roman" w:hAnsi="Times New Roman"/>
@@ -27958,7 +27949,7 @@
       <w:pPr>
         <w:pStyle w:val="Heading2"/>
       </w:pPr>
-      <w:bookmarkStart w:id="103" w:name="_Toc236262493"/>
+      <w:bookmarkStart w:id="103" w:name="_Toc236263689"/>
       <w:r>
         <w:rPr>
           <w:rFonts w:ascii="Times New Roman" w:eastAsia="Times New Roman" w:hAnsi="Times New Roman"/>
@@ -27972,7 +27963,7 @@
       <w:pPr>
         <w:pStyle w:val="TableCaption"/>
       </w:pPr>
-      <w:bookmarkStart w:id="104" w:name="_Toc236262520"/>
+      <w:bookmarkStart w:id="104" w:name="_Toc236263716"/>
       <w:r>
         <w:rPr>
           <w:lang w:val="vi-VN" w:eastAsia="vi-VN"/>
@@ -29257,7 +29248,7 @@
       <w:pPr>
         <w:pStyle w:val="Heading2"/>
       </w:pPr>
-      <w:bookmarkStart w:id="105" w:name="_Toc236262494"/>
+      <w:bookmarkStart w:id="105" w:name="_Toc236263690"/>
       <w:r>
         <w:rPr>
           <w:rFonts w:ascii="Times New Roman" w:eastAsia="Times New Roman" w:hAnsi="Times New Roman"/>
@@ -29272,7 +29263,7 @@
         <w:pStyle w:val="Heading3"/>
         <w:spacing w:after="120" w:line="264" w:lineRule="auto"/>
       </w:pPr>
-      <w:bookmarkStart w:id="106" w:name="_Toc236262495"/>
+      <w:bookmarkStart w:id="106" w:name="_Toc236263691"/>
       <w:r>
         <w:t>B.1. Clone từ GitHub và chạy trên Ubuntu Server</w:t>
       </w:r>
@@ -29317,13 +29308,7 @@
                 <w:sz w:val="17"/>
               </w:rPr>
               <w:br/>
-              <w:t>git clone https://github.com/phuonglatoi/A11-Agentic-SO</w:t>
-            </w:r>
-            <w:r>
-              <w:rPr>
-                <w:sz w:val="17"/>
-              </w:rPr>
-              <w:t>C.git</w:t>
+              <w:t>git clone https://github.com/phuonglatoi/A11-Agentic-SOC.git</w:t>
             </w:r>
             <w:r>
               <w:rPr>
@@ -29602,7 +29587,7 @@
       <w:pPr>
         <w:pStyle w:val="Heading2"/>
       </w:pPr>
-      <w:bookmarkStart w:id="107" w:name="_Toc236262496"/>
+      <w:bookmarkStart w:id="107" w:name="_Toc236263692"/>
       <w:r>
         <w:rPr>
           <w:rFonts w:ascii="Times New Roman" w:eastAsia="Times New Roman" w:hAnsi="Times New Roman"/>
@@ -29881,7 +29866,7 @@
       <w:pPr>
         <w:pStyle w:val="Heading2"/>
       </w:pPr>
-      <w:bookmarkStart w:id="108" w:name="_Toc236262497"/>
+      <w:bookmarkStart w:id="108" w:name="_Toc236263693"/>
       <w:r>
         <w:rPr>
           <w:rFonts w:ascii="Times New Roman" w:eastAsia="Times New Roman" w:hAnsi="Times New Roman"/>
@@ -30113,7 +30098,7 @@
       <w:pPr>
         <w:pStyle w:val="Heading2"/>
       </w:pPr>
-      <w:bookmarkStart w:id="109" w:name="_Toc236262498"/>
+      <w:bookmarkStart w:id="109" w:name="_Toc236263694"/>
       <w:r>
         <w:rPr>
           <w:rFonts w:ascii="Times New Roman" w:eastAsia="Times New Roman" w:hAnsi="Times New Roman"/>
@@ -30223,7 +30208,7 @@
       <w:pPr>
         <w:pStyle w:val="Heading1"/>
       </w:pPr>
-      <w:bookmarkStart w:id="110" w:name="_Toc236262499"/>
+      <w:bookmarkStart w:id="110" w:name="_Toc236263695"/>
       <w:r>
         <w:rPr>
           <w:rFonts w:ascii="Times New Roman" w:eastAsia="Times New Roman" w:hAnsi="Times New Roman"/>
@@ -44257,7 +44242,7 @@
 </file>
 
 <file path=customXml/itemProps1.xml><?xml version="1.0" encoding="utf-8"?>
-<ds:datastoreItem xmlns:ds="http://schemas.openxmlformats.org/officeDocument/2006/customXml" ds:itemID="{E5699707-9D7E-44AA-93A1-D439EBDB6C99}">
+<ds:datastoreItem xmlns:ds="http://schemas.openxmlformats.org/officeDocument/2006/customXml" ds:itemID="{E02D5AC4-5BA2-4A93-A4ED-7F2FF036532C}">
   <ds:schemaRefs>
     <ds:schemaRef ds:uri="http://schemas.openxmlformats.org/officeDocument/2006/bibliography"/>
   </ds:schemaRefs>

</xml_diff>